<commit_message>
chore(relevamientos): script que deriva la plantilla docx del SIPH (#2651)
`relevamientos/scripts/armar_plantilla_siph.py` reemplaza los blancos,
casillas y celdas del docx del area por los tags de docxtpl y quita las
fuentes embebidas, para poder regenerar la plantilla cuando cambie el
formulario. La plantilla se regenera con el script (solo cambia el sangrado
de "Otras"/"Ninguna", ahora igual al del papel).

Refs #2651

Co-Authored-By: Claude Fable 5.1 <noreply@anthropic.com>
</commit_message>
<xml_diff>
--- a/src/backends/sisoc_core/relevamientos/templates/relevamientos/docx/seguimiento_siph.docx
+++ b/src/backends/sisoc_core/relevamientos/templates/relevamientos/docx/seguimiento_siph.docx
@@ -3352,7 +3352,7 @@
         <w:ind w:left="5"/>
       </w:pPr>
       <w:r>
-        <w:t xml:space="preserve">{{ cb_mejora_7 }} Otras. Especificar: {{ mejoras_otras }}</w:t>
+        <w:t xml:space="preserve">        {{ cb_mejora_7 }} Otras. Especificar: {{ mejoras_otras }}</w:t>
       </w:r>
       <w:r>
         <w:t xml:space="preserve"/>
@@ -3377,7 +3377,7 @@
         <w:ind w:left="5"/>
       </w:pPr>
       <w:r>
-        <w:t xml:space="preserve">{{ cb_mejora_8 }} Ninguna</w:t>
+        <w:t xml:space="preserve">        {{ cb_mejora_8 }} Ninguna</w:t>
       </w:r>
     </w:p>
     <w:p>
@@ -3502,7 +3502,7 @@
         <w:ind w:left="5"/>
       </w:pPr>
       <w:r>
-        <w:t xml:space="preserve">{{ cb_dif_4 }} Otras. Especificar: {{ dificultades_otras }}</w:t>
+        <w:t xml:space="preserve">        {{ cb_dif_4 }} Otras. Especificar: {{ dificultades_otras }}</w:t>
       </w:r>
       <w:r>
         <w:t xml:space="preserve"/>
@@ -3527,7 +3527,7 @@
         <w:ind w:left="5"/>
       </w:pPr>
       <w:r>
-        <w:t xml:space="preserve">{{ cb_dif_5 }} Ninguna</w:t>
+        <w:t xml:space="preserve">        {{ cb_dif_5 }} Ninguna</w:t>
       </w:r>
     </w:p>
     <w:p>

</xml_diff>

<commit_message>
fix(relevamientos): SIPH en PDF sin los comentarios del área, el mismo para Gestionar (#2651)
QA (14/10): la descarga de SISOC era docx y traía los comentarios Gescom;
Gestionar mostraba su PDF genérico. Tiene que ser un solo PDF, sin
comentarios, en las dos.

- Plantilla regenerada desde el docx limpio de QA; el script quita los
  comentarios y falla si quedan comentarios o textos de trabajo.
- Descarga en PDF (LibreOffice, como certificación y admisiones):
  seguimiento_pnud_docx pasa a seguimiento_pnud_pdf.
- GET /api/territorial/comedores/{id}/seguimientos-pnud/{pnud_id}/pdf/
  para que la app baje el mismo archivo.
- Firma como imagen del storage (antes el texto inventado "(firma
  registrada)"); casilla vacía con un glifo que la fuente sí tiene.

Refs #2651

Co-Authored-By: Claude Opus 5.5 <noreply@anthropic.com>
</commit_message>
<xml_diff>
--- a/src/backends/sisoc_core/relevamientos/templates/relevamientos/docx/seguimiento_siph.docx
+++ b/src/backends/sisoc_core/relevamientos/templates/relevamientos/docx/seguimiento_siph.docx
@@ -1,6 +1,6 @@
 
 <file path=word/document.xml><?xml version="1.0" encoding="utf-8"?>
-<w:document xmlns:wpc="http://schemas.microsoft.com/office/word/2010/wordprocessingCanvas" xmlns:cx="http://schemas.microsoft.com/office/drawing/2014/chartex" xmlns:cx1="http://schemas.microsoft.com/office/drawing/2015/9/8/chartex" xmlns:cx2="http://schemas.microsoft.com/office/drawing/2015/10/21/chartex" xmlns:cx3="http://schemas.microsoft.com/office/drawing/2016/5/9/chartex" xmlns:cx4="http://schemas.microsoft.com/office/drawing/2016/5/10/chartex" xmlns:cx5="http://schemas.microsoft.com/office/drawing/2016/5/11/chartex" xmlns:cx6="http://schemas.microsoft.com/office/drawing/2016/5/12/chartex" xmlns:cx7="http://schemas.microsoft.com/office/drawing/2016/5/13/chartex" xmlns:cx8="http://schemas.microsoft.com/office/drawing/2016/5/14/chartex" xmlns:mc="http://schemas.openxmlformats.org/markup-compatibility/2006" xmlns:aink="http://schemas.microsoft.com/office/drawing/2016/ink" xmlns:am3d="http://schemas.microsoft.com/office/drawing/2017/model3d" xmlns:o="urn:schemas-microsoft-com:office:office" xmlns:oel="http://schemas.microsoft.com/office/2019/extlst" xmlns:r="http://schemas.openxmlformats.org/officeDocument/2006/relationships" xmlns:m="http://schemas.openxmlformats.org/officeDocument/2006/math" xmlns:v="urn:schemas-microsoft-com:vml" xmlns:wp14="http://schemas.microsoft.com/office/word/2010/wordprocessingDrawing" xmlns:wp="http://schemas.openxmlformats.org/drawingml/2006/wordprocessingDrawing" xmlns:w10="urn:schemas-microsoft-com:office:word" xmlns:w="http://schemas.openxmlformats.org/wordprocessingml/2006/main" xmlns:w14="http://schemas.microsoft.com/office/word/2010/wordml" xmlns:w15="http://schemas.microsoft.com/office/word/2012/wordml" xmlns:w16cex="http://schemas.microsoft.com/office/word/2018/wordml/cex" xmlns:w16cid="http://schemas.microsoft.com/office/word/2016/wordml/cid" xmlns:w16="http://schemas.microsoft.com/office/word/2018/wordml" xmlns:w16du="http://schemas.microsoft.com/office/word/2023/wordml/word16du" xmlns:w16sdtdh="http://schemas.microsoft.com/office/word/2020/wordml/sdtdatahash" xmlns:w16sdtfl="http://schemas.microsoft.com/office/word/2024/wordml/sdtformatlock" xmlns:w16se="http://schemas.microsoft.com/office/word/2015/wordml/symex" xmlns:wpg="http://schemas.microsoft.com/office/word/2010/wordprocessingGroup" xmlns:wpi="http://schemas.microsoft.com/office/word/2010/wordprocessingInk" xmlns:wne="http://schemas.microsoft.com/office/word/2006/wordml" xmlns:wps="http://schemas.microsoft.com/office/word/2010/wordprocessingShape" mc:Ignorable="w14 w15 w16se w16cid w16 w16cex w16sdtdh w16sdtfl w16du wp14">
+<w:document xmlns:wpc="http://schemas.microsoft.com/office/word/2010/wordprocessingCanvas" xmlns:cx="http://schemas.microsoft.com/office/drawing/2014/chartex" xmlns:cx1="http://schemas.microsoft.com/office/drawing/2015/9/8/chartex" xmlns:mc="http://schemas.openxmlformats.org/markup-compatibility/2006" xmlns:o="urn:schemas-microsoft-com:office:office" xmlns:r="http://schemas.openxmlformats.org/officeDocument/2006/relationships" xmlns:m="http://schemas.openxmlformats.org/officeDocument/2006/math" xmlns:v="urn:schemas-microsoft-com:vml" xmlns:wp14="http://schemas.microsoft.com/office/word/2010/wordprocessingDrawing" xmlns:wp="http://schemas.openxmlformats.org/drawingml/2006/wordprocessingDrawing" xmlns:w10="urn:schemas-microsoft-com:office:word" xmlns:w="http://schemas.openxmlformats.org/wordprocessingml/2006/main" xmlns:w14="http://schemas.microsoft.com/office/word/2010/wordml" xmlns:w15="http://schemas.microsoft.com/office/word/2012/wordml" xmlns:w16se="http://schemas.microsoft.com/office/word/2015/wordml/symex" xmlns:wpg="http://schemas.microsoft.com/office/word/2010/wordprocessingGroup" xmlns:wpi="http://schemas.microsoft.com/office/word/2010/wordprocessingInk" xmlns:wne="http://schemas.microsoft.com/office/word/2006/wordml" xmlns:wps="http://schemas.microsoft.com/office/word/2010/wordprocessingShape" mc:Ignorable="w14 w15 w16se wp14">
   <w:body>
     <w:p>
       <w:pPr>
@@ -94,126 +94,6 @@
         </w:rPr>
         <w:t xml:space="preserve">             </w:t>
       </w:r>
-      <w:r>
-        <w:rPr>
-          <w:noProof/>
-        </w:rPr>
-        <mc:AlternateContent>
-          <mc:Choice Requires="wps">
-            <w:drawing>
-              <wp:anchor distT="0" distB="0" distL="114300" distR="114300" simplePos="0" relativeHeight="251658240" behindDoc="0" locked="0" layoutInCell="1" hidden="0" allowOverlap="1" wp14:anchorId="1D52DC3F" wp14:editId="49418405">
-                <wp:simplePos x="0" y="0"/>
-                <wp:positionH relativeFrom="column">
-                  <wp:posOffset>4048125</wp:posOffset>
-                </wp:positionH>
-                <wp:positionV relativeFrom="paragraph">
-                  <wp:posOffset>156319</wp:posOffset>
-                </wp:positionV>
-                <wp:extent cx="333375" cy="1128638"/>
-                <wp:effectExtent l="0" t="0" r="28575" b="14605"/>
-                <wp:wrapNone/>
-                <wp:docPr id="2" name="Cerrar llave 2"/>
-                <wp:cNvGraphicFramePr/>
-                <a:graphic xmlns:a="http://schemas.openxmlformats.org/drawingml/2006/main">
-                  <a:graphicData uri="http://schemas.microsoft.com/office/word/2010/wordprocessingShape">
-                    <wps:wsp>
-                      <wps:cNvSpPr/>
-                      <wps:spPr>
-                        <a:xfrm>
-                          <a:off x="5197100" y="3413304"/>
-                          <a:ext cx="297900" cy="982500"/>
-                        </a:xfrm>
-                        <a:prstGeom prst="rightBrace">
-                          <a:avLst>
-                            <a:gd name="adj1" fmla="val 8333"/>
-                            <a:gd name="adj2" fmla="val 50000"/>
-                          </a:avLst>
-                        </a:prstGeom>
-                        <a:ln>
-                          <a:solidFill>
-                            <a:srgbClr val="0070C0"/>
-                          </a:solidFill>
-                          <a:headEnd type="none" w="sm" len="sm"/>
-                          <a:tailEnd type="none" w="sm" len="sm"/>
-                        </a:ln>
-                      </wps:spPr>
-                      <wps:style>
-                        <a:lnRef idx="1">
-                          <a:schemeClr val="accent1"/>
-                        </a:lnRef>
-                        <a:fillRef idx="0">
-                          <a:schemeClr val="accent1"/>
-                        </a:fillRef>
-                        <a:effectRef idx="0">
-                          <a:schemeClr val="accent1"/>
-                        </a:effectRef>
-                        <a:fontRef idx="minor">
-                          <a:schemeClr val="tx1"/>
-                        </a:fontRef>
-                      </wps:style>
-                      <wps:txbx>
-                        <w:txbxContent>
-                          <w:p>
-                            <w:pPr>
-                              <w:textDirection w:val="btLr"/>
-                              <w:rPr>
-                                <w:color w:val="0070C0"/>
-                              </w:rPr>
-                            </w:pPr>
-                          </w:p>
-                        </w:txbxContent>
-                      </wps:txbx>
-                      <wps:bodyPr spcFirstLastPara="1" wrap="square" lIns="91425" tIns="91425" rIns="91425" bIns="91425" anchor="ctr" anchorCtr="0">
-                        <a:noAutofit/>
-                      </wps:bodyPr>
-                    </wps:wsp>
-                  </a:graphicData>
-                </a:graphic>
-              </wp:anchor>
-            </w:drawing>
-          </mc:Choice>
-          <mc:Fallback>
-            <w:pict>
-              <v:shapetype w14:anchorId="1D52DC3F" id="_x0000_t88" coordsize="21600,21600" o:spt="88" adj="1800,10800" path="m,qx10800@0l10800@2qy21600@11,10800@3l10800@1qy,21600e" filled="f">
-                <v:formulas>
-                  <v:f eqn="val #0"/>
-                  <v:f eqn="sum 21600 0 #0"/>
-                  <v:f eqn="sum #1 0 #0"/>
-                  <v:f eqn="sum #1 #0 0"/>
-                  <v:f eqn="prod #0 9598 32768"/>
-                  <v:f eqn="sum 21600 0 @4"/>
-                  <v:f eqn="sum 21600 0 #1"/>
-                  <v:f eqn="min #1 @6"/>
-                  <v:f eqn="prod @7 1 2"/>
-                  <v:f eqn="prod #0 2 1"/>
-                  <v:f eqn="sum 21600 0 @9"/>
-                  <v:f eqn="val #1"/>
-                </v:formulas>
-                <v:path arrowok="t" o:connecttype="custom" o:connectlocs="0,0;21600,@11;0,21600" textboxrect="0,@4,7637,@5"/>
-                <v:handles>
-                  <v:h position="center,#0" yrange="0,@8"/>
-                  <v:h position="bottomRight,#1" yrange="@9,@10"/>
-                </v:handles>
-              </v:shapetype>
-              <v:shape id="Cerrar llave 2" o:spid="_x0000_s1026" type="#_x0000_t88" style="position:absolute;margin-left:318.75pt;margin-top:12.3pt;width:26.25pt;height:88.85pt;z-index:251658240;visibility:visible;mso-wrap-style:square;mso-wrap-distance-left:9pt;mso-wrap-distance-top:0;mso-wrap-distance-right:9pt;mso-wrap-distance-bottom:0;mso-position-horizontal:absolute;mso-position-horizontal-relative:text;mso-position-vertical:absolute;mso-position-vertical-relative:text;v-text-anchor:middle" o:gfxdata="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" adj="546" strokecolor="#0070c0">
-                <v:stroke startarrowwidth="narrow" startarrowlength="short" endarrowwidth="narrow" endarrowlength="short"/>
-                <v:textbox inset="2.53958mm,2.53958mm,2.53958mm,2.53958mm">
-                  <w:txbxContent>
-                    <w:p>
-                      <w:pPr>
-                        <w:textDirection w:val="btLr"/>
-                        <w:rPr>
-                          <w:color w:val="0070C0"/>
-                        </w:rPr>
-                      </w:pPr>
-                    </w:p>
-                  </w:txbxContent>
-                </v:textbox>
-              </v:shape>
-            </w:pict>
-          </mc:Fallback>
-        </mc:AlternateContent>
-      </w:r>
     </w:p>
     <w:p>
       <w:pPr>
@@ -280,26 +160,6 @@
           <w:bCs/>
         </w:rPr>
         <w:tab/>
-      </w:r>
-      <w:commentRangeStart w:id="0"/>
-      <w:r>
-        <w:rPr>
-          <w:color w:val="0070C0"/>
-          <w:sz w:val="18"/>
-          <w:szCs w:val="18"/>
-        </w:rPr>
-        <w:t/>
-      </w:r>
-      <w:commentRangeEnd w:id="0"/>
-      <w:r>
-        <w:rPr>
-          <w:rStyle w:val="Refdecomentario"/>
-          <w:b/>
-          <w:bCs/>
-          <w:sz w:val="22"/>
-          <w:szCs w:val="22"/>
-        </w:rPr>
-        <w:commentReference w:id="0"/>
       </w:r>
     </w:p>
     <w:p>
@@ -378,7 +238,6 @@
             <w:r>
               <w:t xml:space="preserve"> Fecha y horario de la visita (Día/ mes/ año) (hh:mm): {{ fecha_hora }}</w:t>
             </w:r>
-            <w:commentRangeStart w:id="1"/>
             <w:r>
               <w:rPr>
                 <w:i/>
@@ -386,17 +245,6 @@
               </w:rPr>
               <w:t xml:space="preserve"/>
             </w:r>
-            <w:commentRangeEnd w:id="1"/>
-            <w:r>
-              <w:rPr>
-                <w:rStyle w:val="Refdecomentario"/>
-                <w:i/>
-                <w:iCs/>
-                <w:sz w:val="18"/>
-                <w:szCs w:val="18"/>
-              </w:rPr>
-              <w:commentReference w:id="1"/>
-            </w:r>
           </w:p>
         </w:tc>
       </w:tr>
@@ -455,11 +303,6 @@
       <w:pPr>
         <w:ind w:right="349"/>
         <w:jc w:val="both"/>
-        <w:rPr>
-          <w:color w:val="0070C0"/>
-          <w:sz w:val="18"/>
-          <w:szCs w:val="18"/>
-        </w:rPr>
       </w:pPr>
       <w:r>
         <w:rPr>
@@ -471,6 +314,26 @@
       <w:r>
         <w:t>, marcar con una X según corresponda. En caso de no funcionar o encontrarse cerrado, indicar el motivo.</w:t>
       </w:r>
+    </w:p>
+    <w:p>
+      <w:pPr>
+        <w:ind w:right="349"/>
+        <w:jc w:val="both"/>
+      </w:pPr>
+    </w:p>
+    <w:p>
+      <w:pPr>
+        <w:ind w:right="349"/>
+        <w:jc w:val="both"/>
+      </w:pPr>
+    </w:p>
+    <w:p>
+      <w:pPr>
+        <w:ind w:right="349"/>
+        <w:jc w:val="both"/>
+      </w:pPr>
+      <w:bookmarkStart w:id="0" w:name="_GoBack"/>
+      <w:bookmarkEnd w:id="0"/>
     </w:p>
     <w:p>
       <w:pPr>
@@ -615,16 +478,13 @@
                     <w:id w:val="-1637357077"/>
                   </w:sdtPr>
                   <w:sdtEndPr/>
-                  <w:sdtContent>
-                    <w:commentRangeStart w:id="2"/>
-                  </w:sdtContent>
+                  <w:sdtContent/>
                 </w:sdt>
                 <w:r>
                   <w:t xml:space="preserve">{{ x_cerrado }} Cerrado</w:t>
                 </w:r>
               </w:p>
             </w:tc>
-            <w:commentRangeEnd w:id="2"/>
             <w:tc>
               <w:tcPr>
                 <w:tcW w:w="330" w:type="dxa"/>
@@ -642,14 +502,6 @@
                     <w:szCs w:val="18"/>
                   </w:rPr>
                 </w:pPr>
-                <w:r>
-                  <w:rPr>
-                    <w:rStyle w:val="Refdecomentario"/>
-                    <w:sz w:val="22"/>
-                    <w:szCs w:val="22"/>
-                  </w:rPr>
-                  <w:commentReference w:id="2"/>
-                </w:r>
               </w:p>
             </w:tc>
           </w:tr>
@@ -933,19 +785,8 @@
         </w:rPr>
         <w:t xml:space="preserve"/>
       </w:r>
-      <w:commentRangeStart w:id="3"/>
       <w:r>
         <w:t/>
-      </w:r>
-      <w:commentRangeEnd w:id="3"/>
-      <w:r>
-        <w:rPr>
-          <w:rStyle w:val="Refdecomentario"/>
-          <w:rFonts w:ascii="Times New Roman" w:eastAsia="Times New Roman" w:hAnsi="Times New Roman" w:cs="Times New Roman"/>
-          <w:sz w:val="24"/>
-          <w:szCs w:val="24"/>
-        </w:rPr>
-        <w:commentReference w:id="3"/>
       </w:r>
       <w:r>
         <w:rPr>
@@ -1363,6 +1204,7 @@
               <w:rPr>
                 <w:color w:val="000000"/>
               </w:rPr>
+              <w:lastRenderedPageBreak/>
               <w:t>Lote</w:t>
             </w:r>
           </w:p>
@@ -1431,7 +1273,6 @@
               <w:rPr>
                 <w:color w:val="000000"/>
               </w:rPr>
-              <w:lastRenderedPageBreak/>
               <w:t>Barrio</w:t>
             </w:r>
           </w:p>
@@ -1744,22 +1585,11 @@
         </w:rPr>
         <w:t xml:space="preserve">Nombre de la actividad: {{ actividad_nombre }}</w:t>
       </w:r>
-      <w:commentRangeStart w:id="4"/>
       <w:r>
         <w:rPr>
           <w:color w:val="000000" w:themeColor="text1"/>
         </w:rPr>
         <w:t/>
-      </w:r>
-      <w:commentRangeEnd w:id="4"/>
-      <w:r>
-        <w:rPr>
-          <w:rStyle w:val="Refdecomentario"/>
-          <w:color w:val="000000" w:themeColor="text1"/>
-          <w:sz w:val="22"/>
-          <w:szCs w:val="22"/>
-        </w:rPr>
-        <w:commentReference w:id="4"/>
       </w:r>
     </w:p>
     <w:p>
@@ -1814,7 +1644,6 @@
           <w:tcPr>
             <w:tcW w:w="2117" w:type="dxa"/>
           </w:tcPr>
-          <w:commentRangeStart w:id="5"/>
           <w:p>
             <w:pPr>
               <w:jc w:val="center"/>
@@ -1943,17 +1772,6 @@
               </w:rPr>
               <w:t>de funcionamiento de la actividad</w:t>
             </w:r>
-            <w:commentRangeEnd w:id="5"/>
-            <w:r>
-              <w:rPr>
-                <w:rStyle w:val="Refdecomentario"/>
-                <w:b/>
-                <w:bCs/>
-                <w:sz w:val="22"/>
-                <w:szCs w:val="22"/>
-              </w:rPr>
-              <w:commentReference w:id="5"/>
-            </w:r>
           </w:p>
         </w:tc>
         <w:tc>
@@ -2701,7 +2519,6 @@
         </w:rPr>
         <w:t xml:space="preserve"/>
       </w:r>
-      <w:commentRangeStart w:id="6"/>
       <w:r>
         <w:rPr>
           <w:color w:val="000000" w:themeColor="text1"/>
@@ -2728,16 +2545,6 @@
         </w:rPr>
         <w:tab/>
         <w:t/>
-      </w:r>
-      <w:commentRangeEnd w:id="6"/>
-      <w:r>
-        <w:rPr>
-          <w:rStyle w:val="Refdecomentario"/>
-          <w:color w:val="000000" w:themeColor="text1"/>
-          <w:sz w:val="22"/>
-          <w:szCs w:val="22"/>
-        </w:rPr>
-        <w:commentReference w:id="6"/>
       </w:r>
     </w:p>
     <w:p>
@@ -2865,18 +2672,8 @@
         </w:rPr>
         <w:t xml:space="preserve">5.2 En caso de responder NO, justificar: {{ financiamiento_justificacion }}</w:t>
       </w:r>
-      <w:commentRangeStart w:id="7"/>
       <w:r>
         <w:t/>
-      </w:r>
-      <w:commentRangeEnd w:id="7"/>
-      <w:r>
-        <w:rPr>
-          <w:rStyle w:val="Refdecomentario"/>
-          <w:sz w:val="22"/>
-          <w:szCs w:val="22"/>
-        </w:rPr>
-        <w:commentReference w:id="7"/>
       </w:r>
     </w:p>
     <w:p>
@@ -2957,24 +2754,8 @@
           <w:color w:val="000000" w:themeColor="text1"/>
         </w:rPr>
         <w:tab/>
-      </w:r>
-      <w:commentRangeStart w:id="8"/>
-      <w:r>
-        <w:rPr>
-          <w:color w:val="000000" w:themeColor="text1"/>
-        </w:rPr>
         <w:t/>
       </w:r>
-      <w:commentRangeEnd w:id="8"/>
-      <w:r>
-        <w:rPr>
-          <w:rStyle w:val="Refdecomentario"/>
-          <w:color w:val="000000" w:themeColor="text1"/>
-          <w:sz w:val="22"/>
-          <w:szCs w:val="22"/>
-        </w:rPr>
-        <w:commentReference w:id="8"/>
-      </w:r>
     </w:p>
     <w:p>
       <w:pPr>
@@ -2996,25 +2777,7 @@
         <w:rPr>
           <w:color w:val="000000" w:themeColor="text1"/>
         </w:rPr>
-        <w:t xml:space="preserve"> </w:t>
-      </w:r>
-      <w:commentRangeStart w:id="9"/>
-      <w:r>
-        <w:rPr>
-          <w:color w:val="000000" w:themeColor="text1"/>
-        </w:rPr>
-        <w:t>(opción múltiple)</w:t>
-      </w:r>
-      <w:commentRangeEnd w:id="9"/>
-      <w:r>
-        <w:rPr>
-          <w:rStyle w:val="Refdecomentario"/>
-          <w:rFonts w:ascii="Cambria Math" w:hAnsi="Cambria Math" w:cs="Cambria Math"/>
-          <w:color w:val="000000" w:themeColor="text1"/>
-          <w:sz w:val="22"/>
-          <w:szCs w:val="22"/>
-        </w:rPr>
-        <w:commentReference w:id="9"/>
+        <w:t xml:space="preserve"> (opción múltiple)</w:t>
       </w:r>
     </w:p>
     <w:p>
@@ -3230,26 +2993,7 @@
           <w:b/>
           <w:bCs/>
         </w:rPr>
-        <w:t xml:space="preserve">¿Qué mejoras percibieron a partir de la implementación de los fondos SIPH? </w:t>
-      </w:r>
-      <w:commentRangeStart w:id="10"/>
-      <w:r>
-        <w:rPr>
-          <w:b/>
-          <w:bCs/>
-        </w:rPr>
-        <w:t>(Respuesta múltiple)</w:t>
-      </w:r>
-      <w:commentRangeEnd w:id="10"/>
-      <w:r>
-        <w:rPr>
-          <w:rStyle w:val="Refdecomentario"/>
-          <w:b/>
-          <w:bCs/>
-          <w:sz w:val="22"/>
-          <w:szCs w:val="22"/>
-        </w:rPr>
-        <w:commentReference w:id="10"/>
+        <w:t>¿Qué mejoras percibieron a partir de la implementación de los fondos SIPH? (Respuesta múltiple)</w:t>
       </w:r>
     </w:p>
     <w:p>
@@ -3268,6 +3012,7 @@
         <w:rPr>
           <w:color w:val="000000" w:themeColor="text1"/>
         </w:rPr>
+        <w:lastRenderedPageBreak/>
         <w:t xml:space="preserve">        {{ cb_mejora_1 }} Reconocimiento económico a talleristas</w:t>
       </w:r>
       <w:r>
@@ -3306,7 +3051,6 @@
         <w:ind w:left="5"/>
       </w:pPr>
       <w:r>
-        <w:lastRenderedPageBreak/>
         <w:t xml:space="preserve">        {{ cb_mejora_3 }} Ampliación de días y horarios de las actividades o de su carga horaria</w:t>
       </w:r>
       <w:r>
@@ -3357,18 +3101,8 @@
       <w:r>
         <w:t xml:space="preserve"/>
       </w:r>
-      <w:commentRangeStart w:id="11"/>
       <w:r>
         <w:t/>
-      </w:r>
-      <w:commentRangeEnd w:id="11"/>
-      <w:r>
-        <w:rPr>
-          <w:rStyle w:val="Refdecomentario"/>
-          <w:sz w:val="22"/>
-          <w:szCs w:val="22"/>
-        </w:rPr>
-        <w:commentReference w:id="11"/>
       </w:r>
     </w:p>
     <w:p>
@@ -3432,26 +3166,7 @@
           <w:b/>
           <w:bCs/>
         </w:rPr>
-        <w:t xml:space="preserve">desde la recepción de los fondos? </w:t>
-      </w:r>
-      <w:commentRangeStart w:id="12"/>
-      <w:r>
-        <w:rPr>
-          <w:b/>
-          <w:bCs/>
-        </w:rPr>
-        <w:t>(Respuesta múltiple)</w:t>
-      </w:r>
-      <w:commentRangeEnd w:id="12"/>
-      <w:r>
-        <w:rPr>
-          <w:rStyle w:val="Refdecomentario"/>
-          <w:b/>
-          <w:bCs/>
-          <w:sz w:val="22"/>
-          <w:szCs w:val="22"/>
-        </w:rPr>
-        <w:commentReference w:id="12"/>
+        <w:t>desde la recepción de los fondos? (Respuesta múltiple)</w:t>
       </w:r>
     </w:p>
     <w:p>
@@ -3505,20 +3220,7 @@
         <w:t xml:space="preserve">        {{ cb_dif_4 }} Otras. Especificar: {{ dificultades_otras }}</w:t>
       </w:r>
       <w:r>
-        <w:t xml:space="preserve"/>
-      </w:r>
-      <w:commentRangeStart w:id="13"/>
-      <w:r>
         <w:t/>
-      </w:r>
-      <w:commentRangeEnd w:id="13"/>
-      <w:r>
-        <w:rPr>
-          <w:rStyle w:val="Refdecomentario"/>
-          <w:sz w:val="22"/>
-          <w:szCs w:val="22"/>
-        </w:rPr>
-        <w:commentReference w:id="13"/>
       </w:r>
     </w:p>
     <w:p>
@@ -3576,30 +3278,17 @@
       <w:r>
         <w:t xml:space="preserve"/>
       </w:r>
-      <w:commentRangeStart w:id="14"/>
-      <w:r>
+      <w:r>
+        <w:t xml:space="preserve"/>
+      </w:r>
+      <w:r>
+        <w:rPr>
+          <w:rFonts w:ascii="Cambria Math" w:hAnsi="Cambria Math" w:cs="Cambria Math"/>
+        </w:rPr>
         <w:t/>
       </w:r>
       <w:r>
         <w:t xml:space="preserve"/>
-      </w:r>
-      <w:r>
-        <w:rPr>
-          <w:rFonts w:ascii="Cambria Math" w:hAnsi="Cambria Math" w:cs="Cambria Math"/>
-        </w:rPr>
-        <w:t/>
-      </w:r>
-      <w:r>
-        <w:t xml:space="preserve"/>
-      </w:r>
-      <w:commentRangeEnd w:id="14"/>
-      <w:r>
-        <w:rPr>
-          <w:rStyle w:val="Refdecomentario"/>
-          <w:sz w:val="22"/>
-          <w:szCs w:val="22"/>
-        </w:rPr>
-        <w:commentReference w:id="14"/>
       </w:r>
     </w:p>
     <w:p>
@@ -3620,7 +3309,6 @@
         <w:ind w:right="562"/>
         <w:jc w:val="both"/>
       </w:pPr>
-      <w:commentRangeStart w:id="15"/>
       <w:r>
         <w:rPr>
           <w:b/>
@@ -3654,15 +3342,6 @@
       </w:r>
       <w:r>
         <w:t>or ejemplo, diferenciación de recursos en cada una de las actividades, modificaciones en cuanto a los días y horarios de las actividades, etc.).</w:t>
-      </w:r>
-      <w:commentRangeEnd w:id="15"/>
-      <w:r>
-        <w:rPr>
-          <w:rStyle w:val="Refdecomentario"/>
-          <w:sz w:val="22"/>
-          <w:szCs w:val="22"/>
-        </w:rPr>
-        <w:commentReference w:id="15"/>
       </w:r>
     </w:p>
     <w:p>
@@ -3720,19 +3399,6 @@
       <w:r>
         <w:t xml:space="preserve">  {{ cb_presencial }} Presencial</w:t>
       </w:r>
-      <w:commentRangeStart w:id="16"/>
-      <w:r>
-        <w:t/>
-      </w:r>
-      <w:commentRangeEnd w:id="16"/>
-      <w:r>
-        <w:rPr>
-          <w:rStyle w:val="Refdecomentario"/>
-          <w:sz w:val="22"/>
-          <w:szCs w:val="22"/>
-        </w:rPr>
-        <w:commentReference w:id="16"/>
-      </w:r>
       <w:r>
         <w:t xml:space="preserve"/>
       </w:r>
@@ -3745,19 +3411,6 @@
       </w:pPr>
       <w:r>
         <w:t xml:space="preserve">  {{ cb_virtual }} Virtual</w:t>
-      </w:r>
-      <w:commentRangeStart w:id="17"/>
-      <w:r>
-        <w:t/>
-      </w:r>
-      <w:commentRangeEnd w:id="17"/>
-      <w:r>
-        <w:rPr>
-          <w:rStyle w:val="Refdecomentario"/>
-          <w:sz w:val="22"/>
-          <w:szCs w:val="22"/>
-        </w:rPr>
-        <w:commentReference w:id="17"/>
       </w:r>
     </w:p>
     <w:p>
@@ -3887,9 +3540,9 @@
     </w:tbl>
     <w:p/>
     <w:sectPr>
-      <w:footerReference w:type="default" r:id="rId13"/>
-      <w:headerReference w:type="first" r:id="rId14"/>
-      <w:footerReference w:type="first" r:id="rId15"/>
+      <w:footerReference w:type="default" r:id="rId11"/>
+      <w:headerReference w:type="first" r:id="rId12"/>
+      <w:footerReference w:type="first" r:id="rId13"/>
       <w:pgSz w:w="11910" w:h="16840"/>
       <w:pgMar w:top="360" w:right="853" w:bottom="720" w:left="850" w:header="0" w:footer="532" w:gutter="0"/>
       <w:pgNumType w:start="1"/>
@@ -3900,386 +3553,8 @@
 </w:document>
 </file>
 
-<file path=word/comments.xml><?xml version="1.0" encoding="utf-8"?>
-<w:comments xmlns:wpc="http://schemas.microsoft.com/office/word/2010/wordprocessingCanvas" xmlns:cx="http://schemas.microsoft.com/office/drawing/2014/chartex" xmlns:cx1="http://schemas.microsoft.com/office/drawing/2015/9/8/chartex" xmlns:cx2="http://schemas.microsoft.com/office/drawing/2015/10/21/chartex" xmlns:cx3="http://schemas.microsoft.com/office/drawing/2016/5/9/chartex" xmlns:cx4="http://schemas.microsoft.com/office/drawing/2016/5/10/chartex" xmlns:cx5="http://schemas.microsoft.com/office/drawing/2016/5/11/chartex" xmlns:cx6="http://schemas.microsoft.com/office/drawing/2016/5/12/chartex" xmlns:cx7="http://schemas.microsoft.com/office/drawing/2016/5/13/chartex" xmlns:cx8="http://schemas.microsoft.com/office/drawing/2016/5/14/chartex" xmlns:mc="http://schemas.openxmlformats.org/markup-compatibility/2006" xmlns:aink="http://schemas.microsoft.com/office/drawing/2016/ink" xmlns:am3d="http://schemas.microsoft.com/office/drawing/2017/model3d" xmlns:o="urn:schemas-microsoft-com:office:office" xmlns:oel="http://schemas.microsoft.com/office/2019/extlst" xmlns:r="http://schemas.openxmlformats.org/officeDocument/2006/relationships" xmlns:m="http://schemas.openxmlformats.org/officeDocument/2006/math" xmlns:v="urn:schemas-microsoft-com:vml" xmlns:wp14="http://schemas.microsoft.com/office/word/2010/wordprocessingDrawing" xmlns:wp="http://schemas.openxmlformats.org/drawingml/2006/wordprocessingDrawing" xmlns:w10="urn:schemas-microsoft-com:office:word" xmlns:w="http://schemas.openxmlformats.org/wordprocessingml/2006/main" xmlns:w14="http://schemas.microsoft.com/office/word/2010/wordml" xmlns:w15="http://schemas.microsoft.com/office/word/2012/wordml" xmlns:w16cex="http://schemas.microsoft.com/office/word/2018/wordml/cex" xmlns:w16cid="http://schemas.microsoft.com/office/word/2016/wordml/cid" xmlns:w16="http://schemas.microsoft.com/office/word/2018/wordml" xmlns:w16du="http://schemas.microsoft.com/office/word/2023/wordml/word16du" xmlns:w16sdtdh="http://schemas.microsoft.com/office/word/2020/wordml/sdtdatahash" xmlns:w16sdtfl="http://schemas.microsoft.com/office/word/2024/wordml/sdtformatlock" xmlns:w16se="http://schemas.microsoft.com/office/word/2015/wordml/symex" xmlns:wpg="http://schemas.microsoft.com/office/word/2010/wordprocessingGroup" xmlns:wpi="http://schemas.microsoft.com/office/word/2010/wordprocessingInk" xmlns:wne="http://schemas.microsoft.com/office/word/2006/wordml" xmlns:wps="http://schemas.microsoft.com/office/word/2010/wordprocessingShape" mc:Ignorable="w14 w15 w16se w16cid w16 w16cex w16sdtdh w16sdtfl w16du wp14">
-  <w:comment w:id="0" w:author="Abordaje Comunitario" w:date="2026-09-23T11:50:00Z" w:initials="CM">
-    <w:p>
-      <w:pPr>
-        <w:pStyle w:val="Textocomentario"/>
-      </w:pPr>
-      <w:r>
-        <w:rPr>
-          <w:rStyle w:val="Refdecomentario"/>
-        </w:rPr>
-        <w:annotationRef/>
-      </w:r>
-      <w:r>
-        <w:t>Gescom: debe aparecer a la vista esta información pre cargada.</w:t>
-      </w:r>
-    </w:p>
-  </w:comment>
-  <w:comment w:id="1" w:author="Abordaje Comunitario" w:date="2026-09-23T11:51:00Z" w:initials="CM">
-    <w:p>
-      <w:pPr>
-        <w:pStyle w:val="Textocomentario"/>
-      </w:pPr>
-      <w:r>
-        <w:rPr>
-          <w:rStyle w:val="Refdecomentario"/>
-        </w:rPr>
-        <w:annotationRef/>
-      </w:r>
-      <w:r>
-        <w:t>Gescom: Insertar desplegable de fecha y hora.</w:t>
-      </w:r>
-    </w:p>
-  </w:comment>
-  <w:comment w:id="2" w:author="Area Seguimiento" w:date="2026-08-20T13:00:00Z" w:initials="">
-    <w:p>
-      <w:pPr>
-        <w:pBdr>
-          <w:top w:val="nil"/>
-          <w:left w:val="nil"/>
-          <w:bottom w:val="nil"/>
-          <w:right w:val="nil"/>
-          <w:between w:val="nil"/>
-        </w:pBdr>
-        <w:rPr>
-          <w:rFonts w:ascii="Arial" w:eastAsia="Arial" w:hAnsi="Arial" w:cs="Arial"/>
-          <w:color w:val="000000"/>
-        </w:rPr>
-      </w:pPr>
-      <w:r>
-        <w:rPr>
-          <w:rStyle w:val="Refdecomentario"/>
-        </w:rPr>
-        <w:annotationRef/>
-      </w:r>
-      <w:r>
-        <w:rPr>
-          <w:rFonts w:ascii="Arial" w:eastAsia="Arial" w:hAnsi="Arial" w:cs="Arial"/>
-          <w:color w:val="000000"/>
-        </w:rPr>
-        <w:t>Comentario para Gescom: cuando se selecciona esta opción debe completarse el formulario por desvio (como se hace con el PAC)</w:t>
-      </w:r>
-    </w:p>
-  </w:comment>
-  <w:comment w:id="3" w:author="Abordaje Comunitario" w:date="2026-09-23T10:49:00Z" w:initials="CM">
-    <w:p>
-      <w:pPr>
-        <w:pStyle w:val="Textocomentario"/>
-      </w:pPr>
-      <w:r>
-        <w:rPr>
-          <w:rStyle w:val="Refdecomentario"/>
-        </w:rPr>
-        <w:annotationRef/>
-      </w:r>
-      <w:r>
-        <w:t>Gescom: Si se selecciona SI en la pregunta 3 debe aparecer el domicilio del espacio comunitario. Si se selecciona la respuesta NO, los campos deben aparecer en blanco para poder completar.</w:t>
-      </w:r>
-    </w:p>
-  </w:comment>
-  <w:comment w:id="4" w:author="Abordaje Comunitario" w:date="2026-10-02T09:11:00Z" w:initials="CM">
-    <w:p>
-      <w:pPr>
-        <w:pStyle w:val="Textocomentario"/>
-      </w:pPr>
-      <w:r>
-        <w:rPr>
-          <w:rStyle w:val="Refdecomentario"/>
-        </w:rPr>
-        <w:annotationRef/>
-      </w:r>
-      <w:r>
-        <w:t>Gescom: campo de redacción libre.</w:t>
-      </w:r>
-    </w:p>
-  </w:comment>
-  <w:comment w:id="5" w:author="002 PACK" w:date="2026-10-02T16:18:00Z" w:initials="0P">
-    <w:p>
-      <w:pPr>
-        <w:pStyle w:val="Textocomentario"/>
-      </w:pPr>
-      <w:r>
-        <w:rPr>
-          <w:rStyle w:val="Refdecomentario"/>
-        </w:rPr>
-        <w:annotationRef/>
-      </w:r>
-      <w:r>
-        <w:rPr>
-          <w:color w:val="000000"/>
-        </w:rPr>
-        <w:t>Gescom: acá tendrían que estar precargadas las actividades cargadas en Sisoc y mediante un desplegable poder seleccionar la opción que se está visitando</w:t>
-      </w:r>
-    </w:p>
-  </w:comment>
-  <w:comment w:id="6" w:author="Abordaje Comunitario" w:date="2026-09-23T11:00:00Z" w:initials="CM">
-    <w:p>
-      <w:pPr>
-        <w:pStyle w:val="Textocomentario"/>
-      </w:pPr>
-      <w:r>
-        <w:rPr>
-          <w:rStyle w:val="Refdecomentario"/>
-        </w:rPr>
-        <w:annotationRef/>
-      </w:r>
-      <w:r>
-        <w:t>Gescom: Si se selecciona SI en la pregunta 5 pasa a la pregunta 5.1. Si se selecciona la respuesta NO pasa a la pregunta 5.2.</w:t>
-      </w:r>
-    </w:p>
-  </w:comment>
-  <w:comment w:id="7" w:author="Abordaje Comunitario" w:date="2026-10-02T09:50:00Z" w:initials="CM">
-    <w:p>
-      <w:pPr>
-        <w:pStyle w:val="Textocomentario"/>
-      </w:pPr>
-      <w:r>
-        <w:rPr>
-          <w:rStyle w:val="Refdecomentario"/>
-        </w:rPr>
-        <w:annotationRef/>
-      </w:r>
-      <w:r>
-        <w:t>Gescom: campo libre.</w:t>
-      </w:r>
-    </w:p>
-  </w:comment>
-  <w:comment w:id="8" w:author="Abordaje Comunitario" w:date="2026-10-02T09:59:00Z" w:initials="CM">
-    <w:p>
-      <w:pPr>
-        <w:pStyle w:val="Textocomentario"/>
-      </w:pPr>
-      <w:r>
-        <w:rPr>
-          <w:rStyle w:val="Refdecomentario"/>
-        </w:rPr>
-        <w:annotationRef/>
-      </w:r>
-      <w:r>
-        <w:t>Gescom: Si se selecciona SI en la pregunta 5.3 pasa a la pregunta 5.3.1 y 5.3.2. Si se selecciona la respuesta NO pasa a la pregunta 6.</w:t>
-      </w:r>
-    </w:p>
-  </w:comment>
-  <w:comment w:id="9" w:author="Abordaje Comunitario" w:date="2026-10-02T10:00:00Z" w:initials="CM">
-    <w:p>
-      <w:pPr>
-        <w:pStyle w:val="Textocomentario"/>
-      </w:pPr>
-      <w:r>
-        <w:rPr>
-          <w:rStyle w:val="Refdecomentario"/>
-        </w:rPr>
-        <w:annotationRef/>
-      </w:r>
-      <w:r>
-        <w:t>Gescom: Opción de respuesta múltiple.</w:t>
-      </w:r>
-    </w:p>
-  </w:comment>
-  <w:comment w:id="10" w:author="Abordaje Comunitario" w:date="2026-09-23T11:20:00Z" w:initials="CM">
-    <w:p>
-      <w:pPr>
-        <w:pStyle w:val="Textocomentario"/>
-      </w:pPr>
-      <w:r>
-        <w:rPr>
-          <w:rStyle w:val="Refdecomentario"/>
-        </w:rPr>
-        <w:annotationRef/>
-      </w:r>
-      <w:r>
-        <w:t>Gescom: Opción de respuesta múltiple.</w:t>
-      </w:r>
-    </w:p>
-  </w:comment>
-  <w:comment w:id="11" w:author="Abordaje Comunitario" w:date="2026-09-23T11:20:00Z" w:initials="CM">
-    <w:p>
-      <w:pPr>
-        <w:pStyle w:val="Textocomentario"/>
-      </w:pPr>
-      <w:r>
-        <w:rPr>
-          <w:rStyle w:val="Refdecomentario"/>
-        </w:rPr>
-        <w:annotationRef/>
-      </w:r>
-      <w:r>
-        <w:t xml:space="preserve">Gescom: incorporar campo libre para la redacción. </w:t>
-      </w:r>
-    </w:p>
-  </w:comment>
-  <w:comment w:id="12" w:author="Abordaje Comunitario" w:date="2026-09-23T11:27:00Z" w:initials="CM">
-    <w:p>
-      <w:pPr>
-        <w:pStyle w:val="Textocomentario"/>
-      </w:pPr>
-      <w:r>
-        <w:rPr>
-          <w:rStyle w:val="Refdecomentario"/>
-        </w:rPr>
-        <w:annotationRef/>
-      </w:r>
-      <w:r>
-        <w:t>Gescom: Opción de respuesta múltiple.</w:t>
-      </w:r>
-    </w:p>
-  </w:comment>
-  <w:comment w:id="13" w:author="Abordaje Comunitario" w:date="2026-09-23T11:27:00Z" w:initials="CM">
-    <w:p>
-      <w:pPr>
-        <w:pStyle w:val="Textocomentario"/>
-      </w:pPr>
-      <w:r>
-        <w:rPr>
-          <w:rStyle w:val="Refdecomentario"/>
-        </w:rPr>
-        <w:annotationRef/>
-      </w:r>
-      <w:r>
-        <w:t xml:space="preserve">Gescom: incorporar campo libre para la redacción. </w:t>
-      </w:r>
-    </w:p>
-  </w:comment>
-  <w:comment w:id="14" w:author="Abordaje Comunitario" w:date="2026-09-23T11:29:00Z" w:initials="CM">
-    <w:p>
-      <w:pPr>
-        <w:pStyle w:val="Textocomentario"/>
-      </w:pPr>
-      <w:r>
-        <w:rPr>
-          <w:rStyle w:val="Refdecomentario"/>
-        </w:rPr>
-        <w:annotationRef/>
-      </w:r>
-      <w:r>
-        <w:t>Gescom: Si la respuesta es SI, insertar un campo de redacción libre en Cuáles…….</w:t>
-      </w:r>
-    </w:p>
-  </w:comment>
-  <w:comment w:id="15" w:author="Abordaje Comunitario" w:date="2026-09-23T11:32:00Z" w:initials="CM">
-    <w:p>
-      <w:pPr>
-        <w:pStyle w:val="Textocomentario"/>
-      </w:pPr>
-      <w:r>
-        <w:rPr>
-          <w:rStyle w:val="Refdecomentario"/>
-        </w:rPr>
-        <w:annotationRef/>
-      </w:r>
-      <w:r>
-        <w:t>Gescom: ¿Se puede incorporar el título con la información que acompaña?</w:t>
-      </w:r>
-    </w:p>
-  </w:comment>
-  <w:comment w:id="16" w:author="Abordaje Comunitario" w:date="2026-09-22T09:06:00Z" w:initials="CM">
-    <w:p>
-      <w:pPr>
-        <w:pStyle w:val="Textocomentario"/>
-      </w:pPr>
-      <w:r>
-        <w:rPr>
-          <w:rStyle w:val="Refdecomentario"/>
-        </w:rPr>
-        <w:annotationRef/>
-      </w:r>
-      <w:r>
-        <w:t>Desplegable SISOC: si es presencial abrir ambos campos a continuación para la firma.</w:t>
-      </w:r>
-    </w:p>
-  </w:comment>
-  <w:comment w:id="17" w:author="Abordaje Comunitario" w:date="2026-09-22T09:09:00Z" w:initials="CM">
-    <w:p>
-      <w:pPr>
-        <w:pStyle w:val="Textocomentario"/>
-      </w:pPr>
-      <w:r>
-        <w:rPr>
-          <w:rStyle w:val="Refdecomentario"/>
-        </w:rPr>
-        <w:annotationRef/>
-      </w:r>
-      <w:r>
-        <w:t>Desplegable SISOC: si es virtual abrir a continuación sólo el campo para el nombre y apellido del técnico.</w:t>
-      </w:r>
-    </w:p>
-  </w:comment>
-</w:comments>
-</file>
-
-<file path=word/commentsExtended.xml><?xml version="1.0" encoding="utf-8"?>
-<w15:commentsEx xmlns:wpc="http://schemas.microsoft.com/office/word/2010/wordprocessingCanvas" xmlns:cx="http://schemas.microsoft.com/office/drawing/2014/chartex" xmlns:cx1="http://schemas.microsoft.com/office/drawing/2015/9/8/chartex" xmlns:cx2="http://schemas.microsoft.com/office/drawing/2015/10/21/chartex" xmlns:cx3="http://schemas.microsoft.com/office/drawing/2016/5/9/chartex" xmlns:cx4="http://schemas.microsoft.com/office/drawing/2016/5/10/chartex" xmlns:cx5="http://schemas.microsoft.com/office/drawing/2016/5/11/chartex" xmlns:cx6="http://schemas.microsoft.com/office/drawing/2016/5/12/chartex" xmlns:cx7="http://schemas.microsoft.com/office/drawing/2016/5/13/chartex" xmlns:cx8="http://schemas.microsoft.com/office/drawing/2016/5/14/chartex" xmlns:mc="http://schemas.openxmlformats.org/markup-compatibility/2006" xmlns:aink="http://schemas.microsoft.com/office/drawing/2016/ink" xmlns:am3d="http://schemas.microsoft.com/office/drawing/2017/model3d" xmlns:o="urn:schemas-microsoft-com:office:office" xmlns:oel="http://schemas.microsoft.com/office/2019/extlst" xmlns:r="http://schemas.openxmlformats.org/officeDocument/2006/relationships" xmlns:m="http://schemas.openxmlformats.org/officeDocument/2006/math" xmlns:v="urn:schemas-microsoft-com:vml" xmlns:wp14="http://schemas.microsoft.com/office/word/2010/wordprocessingDrawing" xmlns:wp="http://schemas.openxmlformats.org/drawingml/2006/wordprocessingDrawing" xmlns:w10="urn:schemas-microsoft-com:office:word" xmlns:w="http://schemas.openxmlformats.org/wordprocessingml/2006/main" xmlns:w14="http://schemas.microsoft.com/office/word/2010/wordml" xmlns:w15="http://schemas.microsoft.com/office/word/2012/wordml" xmlns:w16cex="http://schemas.microsoft.com/office/word/2018/wordml/cex" xmlns:w16cid="http://schemas.microsoft.com/office/word/2016/wordml/cid" xmlns:w16="http://schemas.microsoft.com/office/word/2018/wordml" xmlns:w16du="http://schemas.microsoft.com/office/word/2023/wordml/word16du" xmlns:w16sdtdh="http://schemas.microsoft.com/office/word/2020/wordml/sdtdatahash" xmlns:w16sdtfl="http://schemas.microsoft.com/office/word/2024/wordml/sdtformatlock" xmlns:w16se="http://schemas.microsoft.com/office/word/2015/wordml/symex" xmlns:wpg="http://schemas.microsoft.com/office/word/2010/wordprocessingGroup" xmlns:wpi="http://schemas.microsoft.com/office/word/2010/wordprocessingInk" xmlns:wne="http://schemas.microsoft.com/office/word/2006/wordml" xmlns:wps="http://schemas.microsoft.com/office/word/2010/wordprocessingShape" mc:Ignorable="w14 w15 w16se w16cid w16 w16cex w16sdtdh w16sdtfl w16du wp14">
-  <w15:commentEx w15:paraId="6D1B7959" w15:done="0"/>
-  <w15:commentEx w15:paraId="78B51888" w15:done="0"/>
-  <w15:commentEx w15:paraId="000000E5" w15:done="0"/>
-  <w15:commentEx w15:paraId="4C2E13BB" w15:done="0"/>
-  <w15:commentEx w15:paraId="2DD0D9DF" w15:done="0"/>
-  <w15:commentEx w15:paraId="30A1EBA8" w15:done="0"/>
-  <w15:commentEx w15:paraId="759ACC8A" w15:done="0"/>
-  <w15:commentEx w15:paraId="1FA964F6" w15:done="0"/>
-  <w15:commentEx w15:paraId="42EF4305" w15:done="0"/>
-  <w15:commentEx w15:paraId="01B4D281" w15:done="0"/>
-  <w15:commentEx w15:paraId="55465364" w15:done="0"/>
-  <w15:commentEx w15:paraId="10C7B615" w15:done="0"/>
-  <w15:commentEx w15:paraId="0CCF5E0B" w15:done="0"/>
-  <w15:commentEx w15:paraId="17B7E717" w15:done="0"/>
-  <w15:commentEx w15:paraId="00706D54" w15:done="0"/>
-  <w15:commentEx w15:paraId="520916F1" w15:done="0"/>
-  <w15:commentEx w15:paraId="0D1FA746" w15:done="0"/>
-  <w15:commentEx w15:paraId="23843AD6" w15:done="0"/>
-</w15:commentsEx>
-</file>
-
-<file path=word/commentsExtensible.xml><?xml version="1.0" encoding="utf-8"?>
-<w16cex:commentsExtensible xmlns:wpc="http://schemas.microsoft.com/office/word/2010/wordprocessingCanvas" xmlns:cx="http://schemas.microsoft.com/office/drawing/2014/chartex" xmlns:cx1="http://schemas.microsoft.com/office/drawing/2015/9/8/chartex" xmlns:cx2="http://schemas.microsoft.com/office/drawing/2015/10/21/chartex" xmlns:cx3="http://schemas.microsoft.com/office/drawing/2016/5/9/chartex" xmlns:cx4="http://schemas.microsoft.com/office/drawing/2016/5/10/chartex" xmlns:cx5="http://schemas.microsoft.com/office/drawing/2016/5/11/chartex" xmlns:cx6="http://schemas.microsoft.com/office/drawing/2016/5/12/chartex" xmlns:cx7="http://schemas.microsoft.com/office/drawing/2016/5/13/chartex" xmlns:cx8="http://schemas.microsoft.com/office/drawing/2016/5/14/chartex" xmlns:cr="http://schemas.microsoft.com/office/comments/2020/reactions" xmlns:mc="http://schemas.openxmlformats.org/markup-compatibility/2006" xmlns:aink="http://schemas.microsoft.com/office/drawing/2016/ink" xmlns:am3d="http://schemas.microsoft.com/office/drawing/2017/model3d" xmlns:o="urn:schemas-microsoft-com:office:office" xmlns:oel="http://schemas.microsoft.com/office/2019/extlst" xmlns:r="http://schemas.openxmlformats.org/officeDocument/2006/relationships" xmlns:m="http://schemas.openxmlformats.org/officeDocument/2006/math" xmlns:v="urn:schemas-microsoft-com:vml" xmlns:wp14="http://schemas.microsoft.com/office/word/2010/wordprocessingDrawing" xmlns:wp="http://schemas.openxmlformats.org/drawingml/2006/wordprocessingDrawing" xmlns:w10="urn:schemas-microsoft-com:office:word" xmlns:w="http://schemas.openxmlformats.org/wordprocessingml/2006/main" xmlns:w14="http://schemas.microsoft.com/office/word/2010/wordml" xmlns:w15="http://schemas.microsoft.com/office/word/2012/wordml" xmlns:w16cex="http://schemas.microsoft.com/office/word/2018/wordml/cex" xmlns:w16cid="http://schemas.microsoft.com/office/word/2016/wordml/cid" xmlns:w16="http://schemas.microsoft.com/office/word/2018/wordml" xmlns:w16du="http://schemas.microsoft.com/office/word/2023/wordml/word16du" xmlns:w16sdtdh="http://schemas.microsoft.com/office/word/2020/wordml/sdtdatahash" xmlns:w16sdtfl="http://schemas.microsoft.com/office/word/2024/wordml/sdtformatlock" xmlns:w16se="http://schemas.microsoft.com/office/word/2015/wordml/symex" xmlns:wpg="http://schemas.microsoft.com/office/word/2010/wordprocessingGroup" xmlns:wpi="http://schemas.microsoft.com/office/word/2010/wordprocessingInk" xmlns:wne="http://schemas.microsoft.com/office/word/2006/wordml" xmlns:wps="http://schemas.microsoft.com/office/word/2010/wordprocessingShape" mc:Ignorable="w14 w15 w16se w16cid w16 w16cex w16sdtdh w16sdtfl cr w16du wp14">
-  <w16cex:commentExtensible w16cex:durableId="00395BE1" w16cex:dateUtc="2026-09-23T14:50:00Z"/>
-  <w16cex:commentExtensible w16cex:durableId="6D315C6A" w16cex:dateUtc="2026-09-23T14:51:00Z"/>
-  <w16cex:commentExtensible w16cex:durableId="2B398FD3" w16cex:dateUtc="2026-09-23T13:49:00Z"/>
-  <w16cex:commentExtensible w16cex:durableId="3027729A" w16cex:dateUtc="2026-10-02T12:11:00Z"/>
-  <w16cex:commentExtensible w16cex:durableId="1980DDAA" w16cex:dateUtc="2026-10-02T19:18:00Z"/>
-  <w16cex:commentExtensible w16cex:durableId="2A153177" w16cex:dateUtc="2026-09-23T14:00:00Z"/>
-  <w16cex:commentExtensible w16cex:durableId="20985274" w16cex:dateUtc="2026-10-02T12:50:00Z"/>
-  <w16cex:commentExtensible w16cex:durableId="571B4A48" w16cex:dateUtc="2026-10-02T12:59:00Z"/>
-  <w16cex:commentExtensible w16cex:durableId="0166C994" w16cex:dateUtc="2026-10-02T13:00:00Z"/>
-  <w16cex:commentExtensible w16cex:durableId="3C029B24" w16cex:dateUtc="2026-09-23T14:20:00Z"/>
-  <w16cex:commentExtensible w16cex:durableId="7A00984F" w16cex:dateUtc="2026-09-23T14:20:00Z"/>
-  <w16cex:commentExtensible w16cex:durableId="130583E3" w16cex:dateUtc="2026-09-23T14:27:00Z"/>
-  <w16cex:commentExtensible w16cex:durableId="3839DEF3" w16cex:dateUtc="2026-09-23T14:27:00Z"/>
-  <w16cex:commentExtensible w16cex:durableId="496CD6E0" w16cex:dateUtc="2026-09-23T14:29:00Z"/>
-  <w16cex:commentExtensible w16cex:durableId="0B5EF6CA" w16cex:dateUtc="2026-09-23T14:32:00Z"/>
-  <w16cex:commentExtensible w16cex:durableId="30E09938" w16cex:dateUtc="2026-09-22T12:06:00Z"/>
-  <w16cex:commentExtensible w16cex:durableId="641EB2A6" w16cex:dateUtc="2026-09-22T12:09:00Z"/>
-</w16cex:commentsExtensible>
-</file>
-
-<file path=word/commentsIds.xml><?xml version="1.0" encoding="utf-8"?>
-<w16cid:commentsIds xmlns:wpc="http://schemas.microsoft.com/office/word/2010/wordprocessingCanvas" xmlns:cx="http://schemas.microsoft.com/office/drawing/2014/chartex" xmlns:cx1="http://schemas.microsoft.com/office/drawing/2015/9/8/chartex" xmlns:cx2="http://schemas.microsoft.com/office/drawing/2015/10/21/chartex" xmlns:cx3="http://schemas.microsoft.com/office/drawing/2016/5/9/chartex" xmlns:cx4="http://schemas.microsoft.com/office/drawing/2016/5/10/chartex" xmlns:cx5="http://schemas.microsoft.com/office/drawing/2016/5/11/chartex" xmlns:cx6="http://schemas.microsoft.com/office/drawing/2016/5/12/chartex" xmlns:cx7="http://schemas.microsoft.com/office/drawing/2016/5/13/chartex" xmlns:cx8="http://schemas.microsoft.com/office/drawing/2016/5/14/chartex" xmlns:mc="http://schemas.openxmlformats.org/markup-compatibility/2006" xmlns:aink="http://schemas.microsoft.com/office/drawing/2016/ink" xmlns:am3d="http://schemas.microsoft.com/office/drawing/2017/model3d" xmlns:o="urn:schemas-microsoft-com:office:office" xmlns:oel="http://schemas.microsoft.com/office/2019/extlst" xmlns:r="http://schemas.openxmlformats.org/officeDocument/2006/relationships" xmlns:m="http://schemas.openxmlformats.org/officeDocument/2006/math" xmlns:v="urn:schemas-microsoft-com:vml" xmlns:wp14="http://schemas.microsoft.com/office/word/2010/wordprocessingDrawing" xmlns:wp="http://schemas.openxmlformats.org/drawingml/2006/wordprocessingDrawing" xmlns:w10="urn:schemas-microsoft-com:office:word" xmlns:w="http://schemas.openxmlformats.org/wordprocessingml/2006/main" xmlns:w14="http://schemas.microsoft.com/office/word/2010/wordml" xmlns:w15="http://schemas.microsoft.com/office/word/2012/wordml" xmlns:w16cex="http://schemas.microsoft.com/office/word/2018/wordml/cex" xmlns:w16cid="http://schemas.microsoft.com/office/word/2016/wordml/cid" xmlns:w16="http://schemas.microsoft.com/office/word/2018/wordml" xmlns:w16du="http://schemas.microsoft.com/office/word/2023/wordml/word16du" xmlns:w16sdtdh="http://schemas.microsoft.com/office/word/2020/wordml/sdtdatahash" xmlns:w16sdtfl="http://schemas.microsoft.com/office/word/2024/wordml/sdtformatlock" xmlns:w16se="http://schemas.microsoft.com/office/word/2015/wordml/symex" xmlns:wpg="http://schemas.microsoft.com/office/word/2010/wordprocessingGroup" xmlns:wpi="http://schemas.microsoft.com/office/word/2010/wordprocessingInk" xmlns:wne="http://schemas.microsoft.com/office/word/2006/wordml" xmlns:wps="http://schemas.microsoft.com/office/word/2010/wordprocessingShape" mc:Ignorable="w14 w15 w16se w16cid w16 w16cex w16sdtdh w16sdtfl w16du wp14">
-  <w16cid:commentId w16cid:paraId="6D1B7959" w16cid:durableId="00395BE1"/>
-  <w16cid:commentId w16cid:paraId="78B51888" w16cid:durableId="6D315C6A"/>
-  <w16cid:commentId w16cid:paraId="000000E5" w16cid:durableId="000000E5"/>
-  <w16cid:commentId w16cid:paraId="4C2E13BB" w16cid:durableId="2B398FD3"/>
-  <w16cid:commentId w16cid:paraId="2DD0D9DF" w16cid:durableId="3027729A"/>
-  <w16cid:commentId w16cid:paraId="30A1EBA8" w16cid:durableId="1980DDAA"/>
-  <w16cid:commentId w16cid:paraId="759ACC8A" w16cid:durableId="2A153177"/>
-  <w16cid:commentId w16cid:paraId="1FA964F6" w16cid:durableId="20985274"/>
-  <w16cid:commentId w16cid:paraId="42EF4305" w16cid:durableId="571B4A48"/>
-  <w16cid:commentId w16cid:paraId="01B4D281" w16cid:durableId="0166C994"/>
-  <w16cid:commentId w16cid:paraId="55465364" w16cid:durableId="3C029B24"/>
-  <w16cid:commentId w16cid:paraId="10C7B615" w16cid:durableId="7A00984F"/>
-  <w16cid:commentId w16cid:paraId="0CCF5E0B" w16cid:durableId="130583E3"/>
-  <w16cid:commentId w16cid:paraId="17B7E717" w16cid:durableId="3839DEF3"/>
-  <w16cid:commentId w16cid:paraId="00706D54" w16cid:durableId="496CD6E0"/>
-  <w16cid:commentId w16cid:paraId="520916F1" w16cid:durableId="0B5EF6CA"/>
-  <w16cid:commentId w16cid:paraId="0D1FA746" w16cid:durableId="30E09938"/>
-  <w16cid:commentId w16cid:paraId="23843AD6" w16cid:durableId="641EB2A6"/>
-</w16cid:commentsIds>
-</file>
-
 <file path=word/endnotes.xml><?xml version="1.0" encoding="utf-8"?>
-<w:endnotes xmlns:wpc="http://schemas.microsoft.com/office/word/2010/wordprocessingCanvas" xmlns:cx="http://schemas.microsoft.com/office/drawing/2014/chartex" xmlns:cx1="http://schemas.microsoft.com/office/drawing/2015/9/8/chartex" xmlns:cx2="http://schemas.microsoft.com/office/drawing/2015/10/21/chartex" xmlns:cx3="http://schemas.microsoft.com/office/drawing/2016/5/9/chartex" xmlns:cx4="http://schemas.microsoft.com/office/drawing/2016/5/10/chartex" xmlns:cx5="http://schemas.microsoft.com/office/drawing/2016/5/11/chartex" xmlns:cx6="http://schemas.microsoft.com/office/drawing/2016/5/12/chartex" xmlns:cx7="http://schemas.microsoft.com/office/drawing/2016/5/13/chartex" xmlns:cx8="http://schemas.microsoft.com/office/drawing/2016/5/14/chartex" xmlns:mc="http://schemas.openxmlformats.org/markup-compatibility/2006" xmlns:aink="http://schemas.microsoft.com/office/drawing/2016/ink" xmlns:am3d="http://schemas.microsoft.com/office/drawing/2017/model3d" xmlns:o="urn:schemas-microsoft-com:office:office" xmlns:oel="http://schemas.microsoft.com/office/2019/extlst" xmlns:r="http://schemas.openxmlformats.org/officeDocument/2006/relationships" xmlns:m="http://schemas.openxmlformats.org/officeDocument/2006/math" xmlns:v="urn:schemas-microsoft-com:vml" xmlns:wp14="http://schemas.microsoft.com/office/word/2010/wordprocessingDrawing" xmlns:wp="http://schemas.openxmlformats.org/drawingml/2006/wordprocessingDrawing" xmlns:w10="urn:schemas-microsoft-com:office:word" xmlns:w="http://schemas.openxmlformats.org/wordprocessingml/2006/main" xmlns:w14="http://schemas.microsoft.com/office/word/2010/wordml" xmlns:w15="http://schemas.microsoft.com/office/word/2012/wordml" xmlns:w16cex="http://schemas.microsoft.com/office/word/2018/wordml/cex" xmlns:w16cid="http://schemas.microsoft.com/office/word/2016/wordml/cid" xmlns:w16="http://schemas.microsoft.com/office/word/2018/wordml" xmlns:w16du="http://schemas.microsoft.com/office/word/2023/wordml/word16du" xmlns:w16sdtdh="http://schemas.microsoft.com/office/word/2020/wordml/sdtdatahash" xmlns:w16sdtfl="http://schemas.microsoft.com/office/word/2024/wordml/sdtformatlock" xmlns:w16se="http://schemas.microsoft.com/office/word/2015/wordml/symex" xmlns:wpg="http://schemas.microsoft.com/office/word/2010/wordprocessingGroup" xmlns:wpi="http://schemas.microsoft.com/office/word/2010/wordprocessingInk" xmlns:wne="http://schemas.microsoft.com/office/word/2006/wordml" xmlns:wps="http://schemas.microsoft.com/office/word/2010/wordprocessingShape" mc:Ignorable="w14 w15 w16se w16cid w16 w16cex w16sdtdh w16sdtfl w16du wp14">
+<w:endnotes xmlns:wpc="http://schemas.microsoft.com/office/word/2010/wordprocessingCanvas" xmlns:cx="http://schemas.microsoft.com/office/drawing/2014/chartex" xmlns:cx1="http://schemas.microsoft.com/office/drawing/2015/9/8/chartex" xmlns:mc="http://schemas.openxmlformats.org/markup-compatibility/2006" xmlns:o="urn:schemas-microsoft-com:office:office" xmlns:r="http://schemas.openxmlformats.org/officeDocument/2006/relationships" xmlns:m="http://schemas.openxmlformats.org/officeDocument/2006/math" xmlns:v="urn:schemas-microsoft-com:vml" xmlns:wp14="http://schemas.microsoft.com/office/word/2010/wordprocessingDrawing" xmlns:wp="http://schemas.openxmlformats.org/drawingml/2006/wordprocessingDrawing" xmlns:w10="urn:schemas-microsoft-com:office:word" xmlns:w="http://schemas.openxmlformats.org/wordprocessingml/2006/main" xmlns:w14="http://schemas.microsoft.com/office/word/2010/wordml" xmlns:w15="http://schemas.microsoft.com/office/word/2012/wordml" xmlns:w16se="http://schemas.microsoft.com/office/word/2015/wordml/symex" xmlns:wpg="http://schemas.microsoft.com/office/word/2010/wordprocessingGroup" xmlns:wpi="http://schemas.microsoft.com/office/word/2010/wordprocessingInk" xmlns:wne="http://schemas.microsoft.com/office/word/2006/wordml" xmlns:wps="http://schemas.microsoft.com/office/word/2010/wordprocessingShape" mc:Ignorable="w14 w15 w16se wp14">
   <w:endnote w:type="separator" w:id="-1">
     <w:p>
       <w:r>
@@ -4298,7 +3573,7 @@
 </file>
 
 <file path=word/footer1.xml><?xml version="1.0" encoding="utf-8"?>
-<w:ftr xmlns:wpc="http://schemas.microsoft.com/office/word/2010/wordprocessingCanvas" xmlns:cx="http://schemas.microsoft.com/office/drawing/2014/chartex" xmlns:cx1="http://schemas.microsoft.com/office/drawing/2015/9/8/chartex" xmlns:cx2="http://schemas.microsoft.com/office/drawing/2015/10/21/chartex" xmlns:cx3="http://schemas.microsoft.com/office/drawing/2016/5/9/chartex" xmlns:cx4="http://schemas.microsoft.com/office/drawing/2016/5/10/chartex" xmlns:cx5="http://schemas.microsoft.com/office/drawing/2016/5/11/chartex" xmlns:cx6="http://schemas.microsoft.com/office/drawing/2016/5/12/chartex" xmlns:cx7="http://schemas.microsoft.com/office/drawing/2016/5/13/chartex" xmlns:cx8="http://schemas.microsoft.com/office/drawing/2016/5/14/chartex" xmlns:mc="http://schemas.openxmlformats.org/markup-compatibility/2006" xmlns:aink="http://schemas.microsoft.com/office/drawing/2016/ink" xmlns:am3d="http://schemas.microsoft.com/office/drawing/2017/model3d" xmlns:o="urn:schemas-microsoft-com:office:office" xmlns:oel="http://schemas.microsoft.com/office/2019/extlst" xmlns:r="http://schemas.openxmlformats.org/officeDocument/2006/relationships" xmlns:m="http://schemas.openxmlformats.org/officeDocument/2006/math" xmlns:v="urn:schemas-microsoft-com:vml" xmlns:wp14="http://schemas.microsoft.com/office/word/2010/wordprocessingDrawing" xmlns:wp="http://schemas.openxmlformats.org/drawingml/2006/wordprocessingDrawing" xmlns:w10="urn:schemas-microsoft-com:office:word" xmlns:w="http://schemas.openxmlformats.org/wordprocessingml/2006/main" xmlns:w14="http://schemas.microsoft.com/office/word/2010/wordml" xmlns:w15="http://schemas.microsoft.com/office/word/2012/wordml" xmlns:w16cex="http://schemas.microsoft.com/office/word/2018/wordml/cex" xmlns:w16cid="http://schemas.microsoft.com/office/word/2016/wordml/cid" xmlns:w16="http://schemas.microsoft.com/office/word/2018/wordml" xmlns:w16du="http://schemas.microsoft.com/office/word/2023/wordml/word16du" xmlns:w16sdtdh="http://schemas.microsoft.com/office/word/2020/wordml/sdtdatahash" xmlns:w16sdtfl="http://schemas.microsoft.com/office/word/2024/wordml/sdtformatlock" xmlns:w16se="http://schemas.microsoft.com/office/word/2015/wordml/symex" xmlns:wpg="http://schemas.microsoft.com/office/word/2010/wordprocessingGroup" xmlns:wpi="http://schemas.microsoft.com/office/word/2010/wordprocessingInk" xmlns:wne="http://schemas.microsoft.com/office/word/2006/wordml" xmlns:wps="http://schemas.microsoft.com/office/word/2010/wordprocessingShape" mc:Ignorable="w14 w15 w16se w16cid w16 w16cex w16sdtdh w16sdtfl w16du wp14">
+<w:ftr xmlns:wpc="http://schemas.microsoft.com/office/word/2010/wordprocessingCanvas" xmlns:cx="http://schemas.microsoft.com/office/drawing/2014/chartex" xmlns:cx1="http://schemas.microsoft.com/office/drawing/2015/9/8/chartex" xmlns:mc="http://schemas.openxmlformats.org/markup-compatibility/2006" xmlns:o="urn:schemas-microsoft-com:office:office" xmlns:r="http://schemas.openxmlformats.org/officeDocument/2006/relationships" xmlns:m="http://schemas.openxmlformats.org/officeDocument/2006/math" xmlns:v="urn:schemas-microsoft-com:vml" xmlns:wp14="http://schemas.microsoft.com/office/word/2010/wordprocessingDrawing" xmlns:wp="http://schemas.openxmlformats.org/drawingml/2006/wordprocessingDrawing" xmlns:w10="urn:schemas-microsoft-com:office:word" xmlns:w="http://schemas.openxmlformats.org/wordprocessingml/2006/main" xmlns:w14="http://schemas.microsoft.com/office/word/2010/wordml" xmlns:w15="http://schemas.microsoft.com/office/word/2012/wordml" xmlns:w16se="http://schemas.microsoft.com/office/word/2015/wordml/symex" xmlns:wpg="http://schemas.microsoft.com/office/word/2010/wordprocessingGroup" xmlns:wpi="http://schemas.microsoft.com/office/word/2010/wordprocessingInk" xmlns:wne="http://schemas.microsoft.com/office/word/2006/wordml" xmlns:wps="http://schemas.microsoft.com/office/word/2010/wordprocessingShape" mc:Ignorable="w14 w15 w16se wp14">
   <w:p>
     <w:pPr>
       <w:pBdr>
@@ -4371,7 +3646,7 @@
 </file>
 
 <file path=word/footer2.xml><?xml version="1.0" encoding="utf-8"?>
-<w:ftr xmlns:wpc="http://schemas.microsoft.com/office/word/2010/wordprocessingCanvas" xmlns:cx="http://schemas.microsoft.com/office/drawing/2014/chartex" xmlns:cx1="http://schemas.microsoft.com/office/drawing/2015/9/8/chartex" xmlns:cx2="http://schemas.microsoft.com/office/drawing/2015/10/21/chartex" xmlns:cx3="http://schemas.microsoft.com/office/drawing/2016/5/9/chartex" xmlns:cx4="http://schemas.microsoft.com/office/drawing/2016/5/10/chartex" xmlns:cx5="http://schemas.microsoft.com/office/drawing/2016/5/11/chartex" xmlns:cx6="http://schemas.microsoft.com/office/drawing/2016/5/12/chartex" xmlns:cx7="http://schemas.microsoft.com/office/drawing/2016/5/13/chartex" xmlns:cx8="http://schemas.microsoft.com/office/drawing/2016/5/14/chartex" xmlns:mc="http://schemas.openxmlformats.org/markup-compatibility/2006" xmlns:aink="http://schemas.microsoft.com/office/drawing/2016/ink" xmlns:am3d="http://schemas.microsoft.com/office/drawing/2017/model3d" xmlns:o="urn:schemas-microsoft-com:office:office" xmlns:oel="http://schemas.microsoft.com/office/2019/extlst" xmlns:r="http://schemas.openxmlformats.org/officeDocument/2006/relationships" xmlns:m="http://schemas.openxmlformats.org/officeDocument/2006/math" xmlns:v="urn:schemas-microsoft-com:vml" xmlns:wp14="http://schemas.microsoft.com/office/word/2010/wordprocessingDrawing" xmlns:wp="http://schemas.openxmlformats.org/drawingml/2006/wordprocessingDrawing" xmlns:w10="urn:schemas-microsoft-com:office:word" xmlns:w="http://schemas.openxmlformats.org/wordprocessingml/2006/main" xmlns:w14="http://schemas.microsoft.com/office/word/2010/wordml" xmlns:w15="http://schemas.microsoft.com/office/word/2012/wordml" xmlns:w16cex="http://schemas.microsoft.com/office/word/2018/wordml/cex" xmlns:w16cid="http://schemas.microsoft.com/office/word/2016/wordml/cid" xmlns:w16="http://schemas.microsoft.com/office/word/2018/wordml" xmlns:w16du="http://schemas.microsoft.com/office/word/2023/wordml/word16du" xmlns:w16sdtdh="http://schemas.microsoft.com/office/word/2020/wordml/sdtdatahash" xmlns:w16sdtfl="http://schemas.microsoft.com/office/word/2024/wordml/sdtformatlock" xmlns:w16se="http://schemas.microsoft.com/office/word/2015/wordml/symex" xmlns:wpg="http://schemas.microsoft.com/office/word/2010/wordprocessingGroup" xmlns:wpi="http://schemas.microsoft.com/office/word/2010/wordprocessingInk" xmlns:wne="http://schemas.microsoft.com/office/word/2006/wordml" xmlns:wps="http://schemas.microsoft.com/office/word/2010/wordprocessingShape" mc:Ignorable="w14 w15 w16se w16cid w16 w16cex w16sdtdh w16sdtfl w16du wp14">
+<w:ftr xmlns:wpc="http://schemas.microsoft.com/office/word/2010/wordprocessingCanvas" xmlns:cx="http://schemas.microsoft.com/office/drawing/2014/chartex" xmlns:cx1="http://schemas.microsoft.com/office/drawing/2015/9/8/chartex" xmlns:mc="http://schemas.openxmlformats.org/markup-compatibility/2006" xmlns:o="urn:schemas-microsoft-com:office:office" xmlns:r="http://schemas.openxmlformats.org/officeDocument/2006/relationships" xmlns:m="http://schemas.openxmlformats.org/officeDocument/2006/math" xmlns:v="urn:schemas-microsoft-com:vml" xmlns:wp14="http://schemas.microsoft.com/office/word/2010/wordprocessingDrawing" xmlns:wp="http://schemas.openxmlformats.org/drawingml/2006/wordprocessingDrawing" xmlns:w10="urn:schemas-microsoft-com:office:word" xmlns:w="http://schemas.openxmlformats.org/wordprocessingml/2006/main" xmlns:w14="http://schemas.microsoft.com/office/word/2010/wordml" xmlns:w15="http://schemas.microsoft.com/office/word/2012/wordml" xmlns:w16se="http://schemas.microsoft.com/office/word/2015/wordml/symex" xmlns:wpg="http://schemas.microsoft.com/office/word/2010/wordprocessingGroup" xmlns:wpi="http://schemas.microsoft.com/office/word/2010/wordprocessingInk" xmlns:wne="http://schemas.microsoft.com/office/word/2006/wordml" xmlns:wps="http://schemas.microsoft.com/office/word/2010/wordprocessingShape" mc:Ignorable="w14 w15 w16se wp14">
   <w:p>
     <w:pPr>
       <w:jc w:val="right"/>
@@ -4399,7 +3674,7 @@
 </file>
 
 <file path=word/footnotes.xml><?xml version="1.0" encoding="utf-8"?>
-<w:footnotes xmlns:wpc="http://schemas.microsoft.com/office/word/2010/wordprocessingCanvas" xmlns:cx="http://schemas.microsoft.com/office/drawing/2014/chartex" xmlns:cx1="http://schemas.microsoft.com/office/drawing/2015/9/8/chartex" xmlns:cx2="http://schemas.microsoft.com/office/drawing/2015/10/21/chartex" xmlns:cx3="http://schemas.microsoft.com/office/drawing/2016/5/9/chartex" xmlns:cx4="http://schemas.microsoft.com/office/drawing/2016/5/10/chartex" xmlns:cx5="http://schemas.microsoft.com/office/drawing/2016/5/11/chartex" xmlns:cx6="http://schemas.microsoft.com/office/drawing/2016/5/12/chartex" xmlns:cx7="http://schemas.microsoft.com/office/drawing/2016/5/13/chartex" xmlns:cx8="http://schemas.microsoft.com/office/drawing/2016/5/14/chartex" xmlns:mc="http://schemas.openxmlformats.org/markup-compatibility/2006" xmlns:aink="http://schemas.microsoft.com/office/drawing/2016/ink" xmlns:am3d="http://schemas.microsoft.com/office/drawing/2017/model3d" xmlns:o="urn:schemas-microsoft-com:office:office" xmlns:oel="http://schemas.microsoft.com/office/2019/extlst" xmlns:r="http://schemas.openxmlformats.org/officeDocument/2006/relationships" xmlns:m="http://schemas.openxmlformats.org/officeDocument/2006/math" xmlns:v="urn:schemas-microsoft-com:vml" xmlns:wp14="http://schemas.microsoft.com/office/word/2010/wordprocessingDrawing" xmlns:wp="http://schemas.openxmlformats.org/drawingml/2006/wordprocessingDrawing" xmlns:w10="urn:schemas-microsoft-com:office:word" xmlns:w="http://schemas.openxmlformats.org/wordprocessingml/2006/main" xmlns:w14="http://schemas.microsoft.com/office/word/2010/wordml" xmlns:w15="http://schemas.microsoft.com/office/word/2012/wordml" xmlns:w16cex="http://schemas.microsoft.com/office/word/2018/wordml/cex" xmlns:w16cid="http://schemas.microsoft.com/office/word/2016/wordml/cid" xmlns:w16="http://schemas.microsoft.com/office/word/2018/wordml" xmlns:w16du="http://schemas.microsoft.com/office/word/2023/wordml/word16du" xmlns:w16sdtdh="http://schemas.microsoft.com/office/word/2020/wordml/sdtdatahash" xmlns:w16sdtfl="http://schemas.microsoft.com/office/word/2024/wordml/sdtformatlock" xmlns:w16se="http://schemas.microsoft.com/office/word/2015/wordml/symex" xmlns:wpg="http://schemas.microsoft.com/office/word/2010/wordprocessingGroup" xmlns:wpi="http://schemas.microsoft.com/office/word/2010/wordprocessingInk" xmlns:wne="http://schemas.microsoft.com/office/word/2006/wordml" xmlns:wps="http://schemas.microsoft.com/office/word/2010/wordprocessingShape" mc:Ignorable="w14 w15 w16se w16cid w16 w16cex w16sdtdh w16sdtfl w16du wp14">
+<w:footnotes xmlns:wpc="http://schemas.microsoft.com/office/word/2010/wordprocessingCanvas" xmlns:cx="http://schemas.microsoft.com/office/drawing/2014/chartex" xmlns:cx1="http://schemas.microsoft.com/office/drawing/2015/9/8/chartex" xmlns:mc="http://schemas.openxmlformats.org/markup-compatibility/2006" xmlns:o="urn:schemas-microsoft-com:office:office" xmlns:r="http://schemas.openxmlformats.org/officeDocument/2006/relationships" xmlns:m="http://schemas.openxmlformats.org/officeDocument/2006/math" xmlns:v="urn:schemas-microsoft-com:vml" xmlns:wp14="http://schemas.microsoft.com/office/word/2010/wordprocessingDrawing" xmlns:wp="http://schemas.openxmlformats.org/drawingml/2006/wordprocessingDrawing" xmlns:w10="urn:schemas-microsoft-com:office:word" xmlns:w="http://schemas.openxmlformats.org/wordprocessingml/2006/main" xmlns:w14="http://schemas.microsoft.com/office/word/2010/wordml" xmlns:w15="http://schemas.microsoft.com/office/word/2012/wordml" xmlns:w16se="http://schemas.microsoft.com/office/word/2015/wordml/symex" xmlns:wpg="http://schemas.microsoft.com/office/word/2010/wordprocessingGroup" xmlns:wpi="http://schemas.microsoft.com/office/word/2010/wordprocessingInk" xmlns:wne="http://schemas.microsoft.com/office/word/2006/wordml" xmlns:wps="http://schemas.microsoft.com/office/word/2010/wordprocessingShape" mc:Ignorable="w14 w15 w16se wp14">
   <w:footnote w:type="separator" w:id="-1">
     <w:p>
       <w:r>
@@ -4418,7 +3693,7 @@
 </file>
 
 <file path=word/header1.xml><?xml version="1.0" encoding="utf-8"?>
-<w:hdr xmlns:wpc="http://schemas.microsoft.com/office/word/2010/wordprocessingCanvas" xmlns:cx="http://schemas.microsoft.com/office/drawing/2014/chartex" xmlns:cx1="http://schemas.microsoft.com/office/drawing/2015/9/8/chartex" xmlns:cx2="http://schemas.microsoft.com/office/drawing/2015/10/21/chartex" xmlns:cx3="http://schemas.microsoft.com/office/drawing/2016/5/9/chartex" xmlns:cx4="http://schemas.microsoft.com/office/drawing/2016/5/10/chartex" xmlns:cx5="http://schemas.microsoft.com/office/drawing/2016/5/11/chartex" xmlns:cx6="http://schemas.microsoft.com/office/drawing/2016/5/12/chartex" xmlns:cx7="http://schemas.microsoft.com/office/drawing/2016/5/13/chartex" xmlns:cx8="http://schemas.microsoft.com/office/drawing/2016/5/14/chartex" xmlns:mc="http://schemas.openxmlformats.org/markup-compatibility/2006" xmlns:aink="http://schemas.microsoft.com/office/drawing/2016/ink" xmlns:am3d="http://schemas.microsoft.com/office/drawing/2017/model3d" xmlns:o="urn:schemas-microsoft-com:office:office" xmlns:oel="http://schemas.microsoft.com/office/2019/extlst" xmlns:r="http://schemas.openxmlformats.org/officeDocument/2006/relationships" xmlns:m="http://schemas.openxmlformats.org/officeDocument/2006/math" xmlns:v="urn:schemas-microsoft-com:vml" xmlns:wp14="http://schemas.microsoft.com/office/word/2010/wordprocessingDrawing" xmlns:wp="http://schemas.openxmlformats.org/drawingml/2006/wordprocessingDrawing" xmlns:w10="urn:schemas-microsoft-com:office:word" xmlns:w="http://schemas.openxmlformats.org/wordprocessingml/2006/main" xmlns:w14="http://schemas.microsoft.com/office/word/2010/wordml" xmlns:w15="http://schemas.microsoft.com/office/word/2012/wordml" xmlns:w16cex="http://schemas.microsoft.com/office/word/2018/wordml/cex" xmlns:w16cid="http://schemas.microsoft.com/office/word/2016/wordml/cid" xmlns:w16="http://schemas.microsoft.com/office/word/2018/wordml" xmlns:w16du="http://schemas.microsoft.com/office/word/2023/wordml/word16du" xmlns:w16sdtdh="http://schemas.microsoft.com/office/word/2020/wordml/sdtdatahash" xmlns:w16sdtfl="http://schemas.microsoft.com/office/word/2024/wordml/sdtformatlock" xmlns:w16se="http://schemas.microsoft.com/office/word/2015/wordml/symex" xmlns:wpg="http://schemas.microsoft.com/office/word/2010/wordprocessingGroup" xmlns:wpi="http://schemas.microsoft.com/office/word/2010/wordprocessingInk" xmlns:wne="http://schemas.microsoft.com/office/word/2006/wordml" xmlns:wps="http://schemas.microsoft.com/office/word/2010/wordprocessingShape" mc:Ignorable="w14 w15 w16se w16cid w16 w16cex w16sdtdh w16sdtfl w16du wp14">
+<w:hdr xmlns:wpc="http://schemas.microsoft.com/office/word/2010/wordprocessingCanvas" xmlns:cx="http://schemas.microsoft.com/office/drawing/2014/chartex" xmlns:cx1="http://schemas.microsoft.com/office/drawing/2015/9/8/chartex" xmlns:mc="http://schemas.openxmlformats.org/markup-compatibility/2006" xmlns:o="urn:schemas-microsoft-com:office:office" xmlns:r="http://schemas.openxmlformats.org/officeDocument/2006/relationships" xmlns:m="http://schemas.openxmlformats.org/officeDocument/2006/math" xmlns:v="urn:schemas-microsoft-com:vml" xmlns:wp14="http://schemas.microsoft.com/office/word/2010/wordprocessingDrawing" xmlns:wp="http://schemas.openxmlformats.org/drawingml/2006/wordprocessingDrawing" xmlns:w10="urn:schemas-microsoft-com:office:word" xmlns:w="http://schemas.openxmlformats.org/wordprocessingml/2006/main" xmlns:w14="http://schemas.microsoft.com/office/word/2010/wordml" xmlns:w15="http://schemas.microsoft.com/office/word/2012/wordml" xmlns:w16se="http://schemas.microsoft.com/office/word/2015/wordml/symex" xmlns:wpg="http://schemas.microsoft.com/office/word/2010/wordprocessingGroup" xmlns:wpi="http://schemas.microsoft.com/office/word/2010/wordprocessingInk" xmlns:wne="http://schemas.microsoft.com/office/word/2006/wordml" xmlns:wps="http://schemas.microsoft.com/office/word/2010/wordprocessingShape" mc:Ignorable="w14 w15 w16se wp14">
   <w:p>
     <w:pPr>
       <w:pBdr>
@@ -4441,6 +3716,7 @@
       <w:rPr>
         <w:noProof/>
         <w:color w:val="000000"/>
+        <w:lang w:val="es-AR"/>
       </w:rPr>
       <w:drawing>
         <wp:inline distT="0" distB="0" distL="0" distR="0" wp14:anchorId="1250A1FE" wp14:editId="3A633E81">
@@ -4501,7 +3777,7 @@
 </file>
 
 <file path=word/numbering.xml><?xml version="1.0" encoding="utf-8"?>
-<w:numbering xmlns:wpc="http://schemas.microsoft.com/office/word/2010/wordprocessingCanvas" xmlns:cx="http://schemas.microsoft.com/office/drawing/2014/chartex" xmlns:cx1="http://schemas.microsoft.com/office/drawing/2015/9/8/chartex" xmlns:cx2="http://schemas.microsoft.com/office/drawing/2015/10/21/chartex" xmlns:cx3="http://schemas.microsoft.com/office/drawing/2016/5/9/chartex" xmlns:cx4="http://schemas.microsoft.com/office/drawing/2016/5/10/chartex" xmlns:cx5="http://schemas.microsoft.com/office/drawing/2016/5/11/chartex" xmlns:cx6="http://schemas.microsoft.com/office/drawing/2016/5/12/chartex" xmlns:cx7="http://schemas.microsoft.com/office/drawing/2016/5/13/chartex" xmlns:cx8="http://schemas.microsoft.com/office/drawing/2016/5/14/chartex" xmlns:mc="http://schemas.openxmlformats.org/markup-compatibility/2006" xmlns:aink="http://schemas.microsoft.com/office/drawing/2016/ink" xmlns:am3d="http://schemas.microsoft.com/office/drawing/2017/model3d" xmlns:o="urn:schemas-microsoft-com:office:office" xmlns:oel="http://schemas.microsoft.com/office/2019/extlst" xmlns:r="http://schemas.openxmlformats.org/officeDocument/2006/relationships" xmlns:m="http://schemas.openxmlformats.org/officeDocument/2006/math" xmlns:v="urn:schemas-microsoft-com:vml" xmlns:wp14="http://schemas.microsoft.com/office/word/2010/wordprocessingDrawing" xmlns:wp="http://schemas.openxmlformats.org/drawingml/2006/wordprocessingDrawing" xmlns:w10="urn:schemas-microsoft-com:office:word" xmlns:w="http://schemas.openxmlformats.org/wordprocessingml/2006/main" xmlns:w14="http://schemas.microsoft.com/office/word/2010/wordml" xmlns:w15="http://schemas.microsoft.com/office/word/2012/wordml" xmlns:w16cex="http://schemas.microsoft.com/office/word/2018/wordml/cex" xmlns:w16cid="http://schemas.microsoft.com/office/word/2016/wordml/cid" xmlns:w16="http://schemas.microsoft.com/office/word/2018/wordml" xmlns:w16du="http://schemas.microsoft.com/office/word/2023/wordml/word16du" xmlns:w16sdtdh="http://schemas.microsoft.com/office/word/2020/wordml/sdtdatahash" xmlns:w16sdtfl="http://schemas.microsoft.com/office/word/2024/wordml/sdtformatlock" xmlns:w16se="http://schemas.microsoft.com/office/word/2015/wordml/symex" xmlns:wpg="http://schemas.microsoft.com/office/word/2010/wordprocessingGroup" xmlns:wpi="http://schemas.microsoft.com/office/word/2010/wordprocessingInk" xmlns:wne="http://schemas.microsoft.com/office/word/2006/wordml" xmlns:wps="http://schemas.microsoft.com/office/word/2010/wordprocessingShape" mc:Ignorable="w14 w15 w16se w16cid w16 w16cex w16sdtdh w16sdtfl w16du wp14">
+<w:numbering xmlns:wpc="http://schemas.microsoft.com/office/word/2010/wordprocessingCanvas" xmlns:cx="http://schemas.microsoft.com/office/drawing/2014/chartex" xmlns:cx1="http://schemas.microsoft.com/office/drawing/2015/9/8/chartex" xmlns:mc="http://schemas.openxmlformats.org/markup-compatibility/2006" xmlns:o="urn:schemas-microsoft-com:office:office" xmlns:r="http://schemas.openxmlformats.org/officeDocument/2006/relationships" xmlns:m="http://schemas.openxmlformats.org/officeDocument/2006/math" xmlns:v="urn:schemas-microsoft-com:vml" xmlns:wp14="http://schemas.microsoft.com/office/word/2010/wordprocessingDrawing" xmlns:wp="http://schemas.openxmlformats.org/drawingml/2006/wordprocessingDrawing" xmlns:w10="urn:schemas-microsoft-com:office:word" xmlns:w="http://schemas.openxmlformats.org/wordprocessingml/2006/main" xmlns:w14="http://schemas.microsoft.com/office/word/2010/wordml" xmlns:w15="http://schemas.microsoft.com/office/word/2012/wordml" xmlns:w16se="http://schemas.microsoft.com/office/word/2015/wordml/symex" xmlns:wpg="http://schemas.microsoft.com/office/word/2010/wordprocessingGroup" xmlns:wpi="http://schemas.microsoft.com/office/word/2010/wordprocessingInk" xmlns:wne="http://schemas.microsoft.com/office/word/2006/wordml" xmlns:wps="http://schemas.microsoft.com/office/word/2010/wordprocessingShape" mc:Ignorable="w14 w15 w16se wp14">
   <w:abstractNum w:abstractNumId="0" w15:restartNumberingAfterBreak="0">
     <w:nsid w:val="31902D3D"/>
     <w:multiLevelType w:val="multilevel"/>
@@ -4963,34 +4239,31 @@
       </w:rPr>
     </w:lvl>
   </w:abstractNum>
-  <w:num w:numId="1" w16cid:durableId="717976273">
+  <w:num w:numId="1">
     <w:abstractNumId w:val="2"/>
   </w:num>
-  <w:num w:numId="2" w16cid:durableId="107702945">
+  <w:num w:numId="2">
     <w:abstractNumId w:val="0"/>
   </w:num>
-  <w:num w:numId="3" w16cid:durableId="1950696392">
+  <w:num w:numId="3">
     <w:abstractNumId w:val="1"/>
   </w:num>
-  <w:num w:numId="4" w16cid:durableId="659699355">
+  <w:num w:numId="4">
     <w:abstractNumId w:val="3"/>
   </w:num>
 </w:numbering>
 </file>
 
 <file path=word/people.xml><?xml version="1.0" encoding="utf-8"?>
-<w15:people xmlns:wpc="http://schemas.microsoft.com/office/word/2010/wordprocessingCanvas" xmlns:cx="http://schemas.microsoft.com/office/drawing/2014/chartex" xmlns:cx1="http://schemas.microsoft.com/office/drawing/2015/9/8/chartex" xmlns:cx2="http://schemas.microsoft.com/office/drawing/2015/10/21/chartex" xmlns:cx3="http://schemas.microsoft.com/office/drawing/2016/5/9/chartex" xmlns:cx4="http://schemas.microsoft.com/office/drawing/2016/5/10/chartex" xmlns:cx5="http://schemas.microsoft.com/office/drawing/2016/5/11/chartex" xmlns:cx6="http://schemas.microsoft.com/office/drawing/2016/5/12/chartex" xmlns:cx7="http://schemas.microsoft.com/office/drawing/2016/5/13/chartex" xmlns:cx8="http://schemas.microsoft.com/office/drawing/2016/5/14/chartex" xmlns:mc="http://schemas.openxmlformats.org/markup-compatibility/2006" xmlns:aink="http://schemas.microsoft.com/office/drawing/2016/ink" xmlns:am3d="http://schemas.microsoft.com/office/drawing/2017/model3d" xmlns:o="urn:schemas-microsoft-com:office:office" xmlns:oel="http://schemas.microsoft.com/office/2019/extlst" xmlns:r="http://schemas.openxmlformats.org/officeDocument/2006/relationships" xmlns:m="http://schemas.openxmlformats.org/officeDocument/2006/math" xmlns:v="urn:schemas-microsoft-com:vml" xmlns:wp14="http://schemas.microsoft.com/office/word/2010/wordprocessingDrawing" xmlns:wp="http://schemas.openxmlformats.org/drawingml/2006/wordprocessingDrawing" xmlns:w10="urn:schemas-microsoft-com:office:word" xmlns:w="http://schemas.openxmlformats.org/wordprocessingml/2006/main" xmlns:w14="http://schemas.microsoft.com/office/word/2010/wordml" xmlns:w15="http://schemas.microsoft.com/office/word/2012/wordml" xmlns:w16cex="http://schemas.microsoft.com/office/word/2018/wordml/cex" xmlns:w16cid="http://schemas.microsoft.com/office/word/2016/wordml/cid" xmlns:w16="http://schemas.microsoft.com/office/word/2018/wordml" xmlns:w16du="http://schemas.microsoft.com/office/word/2023/wordml/word16du" xmlns:w16sdtdh="http://schemas.microsoft.com/office/word/2020/wordml/sdtdatahash" xmlns:w16sdtfl="http://schemas.microsoft.com/office/word/2024/wordml/sdtformatlock" xmlns:w16se="http://schemas.microsoft.com/office/word/2015/wordml/symex" xmlns:wpg="http://schemas.microsoft.com/office/word/2010/wordprocessingGroup" xmlns:wpi="http://schemas.microsoft.com/office/word/2010/wordprocessingInk" xmlns:wne="http://schemas.microsoft.com/office/word/2006/wordml" xmlns:wps="http://schemas.microsoft.com/office/word/2010/wordprocessingShape" mc:Ignorable="w14 w15 w16se w16cid w16 w16cex w16sdtdh w16sdtfl w16du wp14">
-  <w15:person w15:author="Abordaje Comunitario">
-    <w15:presenceInfo w15:providerId="None" w15:userId="Abordaje Comunitario"/>
-  </w15:person>
-  <w15:person w15:author="002 PACK">
-    <w15:presenceInfo w15:providerId="AD" w15:userId="S::002PACK@prodeso.org.ar::381045c5-8f44-4e0d-b129-ee99cdc3578f"/>
+<w15:people xmlns:wpc="http://schemas.microsoft.com/office/word/2010/wordprocessingCanvas" xmlns:cx="http://schemas.microsoft.com/office/drawing/2014/chartex" xmlns:cx1="http://schemas.microsoft.com/office/drawing/2015/9/8/chartex" xmlns:mc="http://schemas.openxmlformats.org/markup-compatibility/2006" xmlns:o="urn:schemas-microsoft-com:office:office" xmlns:r="http://schemas.openxmlformats.org/officeDocument/2006/relationships" xmlns:m="http://schemas.openxmlformats.org/officeDocument/2006/math" xmlns:v="urn:schemas-microsoft-com:vml" xmlns:wp14="http://schemas.microsoft.com/office/word/2010/wordprocessingDrawing" xmlns:wp="http://schemas.openxmlformats.org/drawingml/2006/wordprocessingDrawing" xmlns:w10="urn:schemas-microsoft-com:office:word" xmlns:w="http://schemas.openxmlformats.org/wordprocessingml/2006/main" xmlns:w14="http://schemas.microsoft.com/office/word/2010/wordml" xmlns:w15="http://schemas.microsoft.com/office/word/2012/wordml" xmlns:w16se="http://schemas.microsoft.com/office/word/2015/wordml/symex" xmlns:wpg="http://schemas.microsoft.com/office/word/2010/wordprocessingGroup" xmlns:wpi="http://schemas.microsoft.com/office/word/2010/wordprocessingInk" xmlns:wne="http://schemas.microsoft.com/office/word/2006/wordml" xmlns:wps="http://schemas.microsoft.com/office/word/2010/wordprocessingShape" mc:Ignorable="w14 w15 w16se wp14">
+  <w15:person w15:author="Lenovo">
+    <w15:presenceInfo w15:providerId="None" w15:userId="Lenovo"/>
   </w15:person>
 </w15:people>
 </file>
 
 <file path=word/styles.xml><?xml version="1.0" encoding="utf-8"?>
-<w:styles xmlns:mc="http://schemas.openxmlformats.org/markup-compatibility/2006" xmlns:r="http://schemas.openxmlformats.org/officeDocument/2006/relationships" xmlns:w="http://schemas.openxmlformats.org/wordprocessingml/2006/main" xmlns:w14="http://schemas.microsoft.com/office/word/2010/wordml" xmlns:w15="http://schemas.microsoft.com/office/word/2012/wordml" xmlns:w16cex="http://schemas.microsoft.com/office/word/2018/wordml/cex" xmlns:w16cid="http://schemas.microsoft.com/office/word/2016/wordml/cid" xmlns:w16="http://schemas.microsoft.com/office/word/2018/wordml" xmlns:w16du="http://schemas.microsoft.com/office/word/2023/wordml/word16du" xmlns:w16sdtdh="http://schemas.microsoft.com/office/word/2020/wordml/sdtdatahash" xmlns:w16sdtfl="http://schemas.microsoft.com/office/word/2024/wordml/sdtformatlock" xmlns:w16se="http://schemas.microsoft.com/office/word/2015/wordml/symex" mc:Ignorable="w14 w15 w16se w16cid w16 w16cex w16sdtdh w16sdtfl w16du">
+<w:styles xmlns:mc="http://schemas.openxmlformats.org/markup-compatibility/2006" xmlns:r="http://schemas.openxmlformats.org/officeDocument/2006/relationships" xmlns:w="http://schemas.openxmlformats.org/wordprocessingml/2006/main" xmlns:w14="http://schemas.microsoft.com/office/word/2010/wordml" xmlns:w15="http://schemas.microsoft.com/office/word/2012/wordml" xmlns:w16se="http://schemas.microsoft.com/office/word/2015/wordml/symex" mc:Ignorable="w14 w15 w16se">
   <w:docDefaults>
     <w:rPrDefault>
       <w:rPr>
@@ -5006,7 +4279,7 @@
       </w:pPr>
     </w:pPrDefault>
   </w:docDefaults>
-  <w:latentStyles w:defLockedState="0" w:defUIPriority="99" w:defSemiHidden="0" w:defUnhideWhenUsed="0" w:defQFormat="0" w:count="376">
+  <w:latentStyles w:defLockedState="0" w:defUIPriority="99" w:defSemiHidden="0" w:defUnhideWhenUsed="0" w:defQFormat="0" w:count="371">
     <w:lsdException w:name="Normal" w:uiPriority="0" w:qFormat="1"/>
     <w:lsdException w:name="heading 1" w:uiPriority="9" w:qFormat="1"/>
     <w:lsdException w:name="heading 2" w:semiHidden="1" w:uiPriority="9" w:unhideWhenUsed="1" w:qFormat="1"/>
@@ -5378,11 +4651,6 @@
     <w:lsdException w:name="List Table 5 Dark Accent 6" w:uiPriority="50"/>
     <w:lsdException w:name="List Table 6 Colorful Accent 6" w:uiPriority="51"/>
     <w:lsdException w:name="List Table 7 Colorful Accent 6" w:uiPriority="52"/>
-    <w:lsdException w:name="Mention" w:semiHidden="1" w:unhideWhenUsed="1"/>
-    <w:lsdException w:name="Smart Hyperlink" w:semiHidden="1" w:unhideWhenUsed="1"/>
-    <w:lsdException w:name="Hashtag" w:semiHidden="1" w:unhideWhenUsed="1"/>
-    <w:lsdException w:name="Unresolved Mention" w:semiHidden="1" w:unhideWhenUsed="1"/>
-    <w:lsdException w:name="Smart Link" w:semiHidden="1" w:unhideWhenUsed="1"/>
   </w:latentStyles>
   <w:style w:type="paragraph" w:default="1" w:styleId="Normal">
     <w:name w:val="Normal"/>
@@ -5761,6 +5029,75 @@
       <w:contextualSpacing/>
     </w:pPr>
   </w:style>
+  <w:style w:type="paragraph" w:styleId="Textodeglobo">
+    <w:name w:val="Balloon Text"/>
+    <w:basedOn w:val="Normal"/>
+    <w:link w:val="TextodegloboCar"/>
+    <w:uiPriority w:val="99"/>
+    <w:semiHidden/>
+    <w:unhideWhenUsed/>
+    <w:rsid w:val="00E55276"/>
+    <w:rPr>
+      <w:rFonts w:ascii="Segoe UI" w:hAnsi="Segoe UI" w:cs="Segoe UI"/>
+      <w:sz w:val="18"/>
+      <w:szCs w:val="18"/>
+    </w:rPr>
+  </w:style>
+  <w:style w:type="character" w:customStyle="1" w:styleId="TextodegloboCar">
+    <w:name w:val="Texto de globo Car"/>
+    <w:basedOn w:val="Fuentedeprrafopredeter"/>
+    <w:link w:val="Textodeglobo"/>
+    <w:uiPriority w:val="99"/>
+    <w:semiHidden/>
+    <w:rsid w:val="00E55276"/>
+    <w:rPr>
+      <w:rFonts w:ascii="Segoe UI" w:hAnsi="Segoe UI" w:cs="Segoe UI"/>
+      <w:sz w:val="18"/>
+      <w:szCs w:val="18"/>
+    </w:rPr>
+  </w:style>
+  <w:style w:type="paragraph" w:styleId="Encabezado">
+    <w:name w:val="header"/>
+    <w:basedOn w:val="Normal"/>
+    <w:link w:val="EncabezadoCar"/>
+    <w:uiPriority w:val="99"/>
+    <w:unhideWhenUsed/>
+    <w:rsid w:val="00E55276"/>
+    <w:pPr>
+      <w:tabs>
+        <w:tab w:val="center" w:pos="4252"/>
+        <w:tab w:val="right" w:pos="8504"/>
+      </w:tabs>
+    </w:pPr>
+  </w:style>
+  <w:style w:type="character" w:customStyle="1" w:styleId="EncabezadoCar">
+    <w:name w:val="Encabezado Car"/>
+    <w:basedOn w:val="Fuentedeprrafopredeter"/>
+    <w:link w:val="Encabezado"/>
+    <w:uiPriority w:val="99"/>
+    <w:rsid w:val="00E55276"/>
+  </w:style>
+  <w:style w:type="paragraph" w:styleId="Piedepgina">
+    <w:name w:val="footer"/>
+    <w:basedOn w:val="Normal"/>
+    <w:link w:val="PiedepginaCar"/>
+    <w:uiPriority w:val="99"/>
+    <w:unhideWhenUsed/>
+    <w:rsid w:val="00E55276"/>
+    <w:pPr>
+      <w:tabs>
+        <w:tab w:val="center" w:pos="4252"/>
+        <w:tab w:val="right" w:pos="8504"/>
+      </w:tabs>
+    </w:pPr>
+  </w:style>
+  <w:style w:type="character" w:customStyle="1" w:styleId="PiedepginaCar">
+    <w:name w:val="Pie de página Car"/>
+    <w:basedOn w:val="Fuentedeprrafopredeter"/>
+    <w:link w:val="Piedepgina"/>
+    <w:uiPriority w:val="99"/>
+    <w:rsid w:val="00E55276"/>
+  </w:style>
 </w:styles>
 </file>
 
@@ -6085,28 +5422,28 @@
 </file>
 
 <file path=customXml/item1.xml><?xml version="1.0" encoding="utf-8"?>
-<b:Sources xmlns:b="http://schemas.openxmlformats.org/officeDocument/2006/bibliography" xmlns="http://schemas.openxmlformats.org/officeDocument/2006/bibliography" SelectedStyle="\APASixthEditionOfficeOnline.xsl" StyleName="APA" Version="6"/>
-</file>
-
-<file path=customXml/item2.xml><?xml version="1.0" encoding="utf-8"?>
 <go:gDocsCustomXmlDataStorage xmlns:go="http://customooxmlschemas.google.com/" xmlns:r="http://schemas.openxmlformats.org/officeDocument/2006/relationships" uri="GoogleDocsCustomDataVersion2">
   <go:docsCustomData xmlns:go="http://customooxmlschemas.google.com/" roundtripDataSignature="AMtx7mg5gZQjwTqDQrqwgK4RLDVpWdSzMQ==">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</go:docsCustomData>
 </go:gDocsCustomXmlDataStorage>
 </file>
 
-<file path=customXml/itemProps1.xml><?xml version="1.0" encoding="utf-8"?>
-<ds:datastoreItem xmlns:ds="http://schemas.openxmlformats.org/officeDocument/2006/customXml" ds:itemID="{2F5BA12B-CE33-4EE0-B247-F6685338FBD9}">
-  <ds:schemaRefs>
-    <ds:schemaRef ds:uri="http://schemas.openxmlformats.org/officeDocument/2006/bibliography"/>
-  </ds:schemaRefs>
-</ds:datastoreItem>
+<file path=customXml/item2.xml><?xml version="1.0" encoding="utf-8"?>
+<b:Sources xmlns:b="http://schemas.openxmlformats.org/officeDocument/2006/bibliography" xmlns="http://schemas.openxmlformats.org/officeDocument/2006/bibliography" SelectedStyle="\APASixthEditionOfficeOnline.xsl" StyleName="APA" Version="6"/>
 </file>
 
-<file path=customXml/itemProps2.xml><?xml version="1.0" encoding="utf-8"?>
+<file path=customXml/itemProps1.xml><?xml version="1.0" encoding="utf-8"?>
 <ds:datastoreItem xmlns:ds="http://schemas.openxmlformats.org/officeDocument/2006/customXml" ds:itemID="{11111111-1234-1234-1234-123412341234}">
   <ds:schemaRefs>
     <ds:schemaRef ds:uri="http://customooxmlschemas.google.com/"/>
     <ds:schemaRef ds:uri="http://schemas.openxmlformats.org/officeDocument/2006/relationships"/>
   </ds:schemaRefs>
 </ds:datastoreItem>
+</file>
+
+<file path=customXml/itemProps2.xml><?xml version="1.0" encoding="utf-8"?>
+<ds:datastoreItem xmlns:ds="http://schemas.openxmlformats.org/officeDocument/2006/customXml" ds:itemID="{E0E11B50-DC57-493E-B761-F881AD8F98BF}">
+  <ds:schemaRefs>
+    <ds:schemaRef ds:uri="http://schemas.openxmlformats.org/officeDocument/2006/bibliography"/>
+  </ds:schemaRefs>
+</ds:datastoreItem>
 </file>
</xml_diff>